<commit_message>
Chapter 5 Design Rationale and Trade-Off Analysis polished
</commit_message>
<xml_diff>
--- a/07_documentation/final_doc.docx
+++ b/07_documentation/final_doc.docx
@@ -1408,7 +1408,27 @@
           <w:lang w:eastAsia="en-DE"/>
           <w14:ligatures w14:val="none"/>
         </w:rPr>
-        <w:t>The continuous growth of urban traffic demand has increased congestion, travel delays, fuel consumption, and accident risks at road intersections. Traditional intersection control methods, particularly traffic light systems, rely on predefined signaling strategies that are often unable to adapt efficiently to dynamic traffic conditions. As cities move toward intelligent transportation infrastructures, more advanced traffic management approaches are required to improve traffic flow, safety, and resource utilization.</w:t>
+        <w:t xml:space="preserve">The continuous growth of urban traffic demand has increased congestion, travel delays, fuel consumption, and accident risks at road intersections. Traditional intersection control methods, particularly traffic light systems, rely on predefined </w:t>
+      </w:r>
+      <w:proofErr w:type="spellStart"/>
+      <w:r>
+        <w:rPr>
+          <w:rFonts w:ascii="Times New Roman" w:eastAsia="Times New Roman" w:hAnsi="Times New Roman" w:cs="Times New Roman"/>
+          <w:kern w:val="0"/>
+          <w:lang w:eastAsia="en-DE"/>
+          <w14:ligatures w14:val="none"/>
+        </w:rPr>
+        <w:t>signaling</w:t>
+      </w:r>
+      <w:proofErr w:type="spellEnd"/>
+      <w:r>
+        <w:rPr>
+          <w:rFonts w:ascii="Times New Roman" w:eastAsia="Times New Roman" w:hAnsi="Times New Roman" w:cs="Times New Roman"/>
+          <w:kern w:val="0"/>
+          <w:lang w:eastAsia="en-DE"/>
+          <w14:ligatures w14:val="none"/>
+        </w:rPr>
+        <w:t xml:space="preserve"> strategies that are often unable to adapt efficiently to dynamic traffic conditions. As cities move toward intelligent transportation infrastructures, more advanced traffic management approaches are required to improve traffic flow, safety, and resource utilization.</w:t>
       </w:r>
     </w:p>
     <w:p>
@@ -2013,7 +2033,27 @@
           <w:lang w:eastAsia="en-DE"/>
           <w14:ligatures w14:val="none"/>
         </w:rPr>
-        <w:t>Prepare the architecture for FreeRTOS-based embedded implementation.</w:t>
+        <w:t xml:space="preserve">Prepare the architecture for </w:t>
+      </w:r>
+      <w:proofErr w:type="spellStart"/>
+      <w:r>
+        <w:rPr>
+          <w:rFonts w:ascii="Times New Roman" w:eastAsia="Times New Roman" w:hAnsi="Times New Roman" w:cs="Times New Roman"/>
+          <w:kern w:val="0"/>
+          <w:lang w:eastAsia="en-DE"/>
+          <w14:ligatures w14:val="none"/>
+        </w:rPr>
+        <w:t>FreeRTOS</w:t>
+      </w:r>
+      <w:proofErr w:type="spellEnd"/>
+      <w:r>
+        <w:rPr>
+          <w:rFonts w:ascii="Times New Roman" w:eastAsia="Times New Roman" w:hAnsi="Times New Roman" w:cs="Times New Roman"/>
+          <w:kern w:val="0"/>
+          <w:lang w:eastAsia="en-DE"/>
+          <w14:ligatures w14:val="none"/>
+        </w:rPr>
+        <w:t>-based embedded implementation.</w:t>
       </w:r>
     </w:p>
     <w:p>
@@ -6314,14 +6354,25 @@
                 <w14:ligatures w14:val="none"/>
               </w:rPr>
             </w:pPr>
-            <w:r>
-              <w:rPr>
-                <w:rFonts w:ascii="Times New Roman" w:eastAsia="Times New Roman" w:hAnsi="Times New Roman" w:cs="Times New Roman"/>
-                <w:kern w:val="0"/>
-                <w:lang w:eastAsia="en-DE"/>
-                <w14:ligatures w14:val="none"/>
-              </w:rPr>
-              <w:t>Preempted schedule</w:t>
+            <w:proofErr w:type="spellStart"/>
+            <w:r>
+              <w:rPr>
+                <w:rFonts w:ascii="Times New Roman" w:eastAsia="Times New Roman" w:hAnsi="Times New Roman" w:cs="Times New Roman"/>
+                <w:kern w:val="0"/>
+                <w:lang w:eastAsia="en-DE"/>
+                <w14:ligatures w14:val="none"/>
+              </w:rPr>
+              <w:t>Preempted</w:t>
+            </w:r>
+            <w:proofErr w:type="spellEnd"/>
+            <w:r>
+              <w:rPr>
+                <w:rFonts w:ascii="Times New Roman" w:eastAsia="Times New Roman" w:hAnsi="Times New Roman" w:cs="Times New Roman"/>
+                <w:kern w:val="0"/>
+                <w:lang w:eastAsia="en-DE"/>
+                <w14:ligatures w14:val="none"/>
+              </w:rPr>
+              <w:t xml:space="preserve"> schedule</w:t>
             </w:r>
           </w:p>
         </w:tc>
@@ -6760,7 +6811,27 @@
                 <w:lang w:eastAsia="en-DE"/>
                 <w14:ligatures w14:val="none"/>
               </w:rPr>
-              <w:t>≤ 50 ms latency</w:t>
+              <w:t xml:space="preserve">≤ 50 </w:t>
+            </w:r>
+            <w:proofErr w:type="spellStart"/>
+            <w:r>
+              <w:rPr>
+                <w:rFonts w:ascii="Times New Roman" w:eastAsia="Times New Roman" w:hAnsi="Times New Roman" w:cs="Times New Roman"/>
+                <w:kern w:val="0"/>
+                <w:lang w:eastAsia="en-DE"/>
+                <w14:ligatures w14:val="none"/>
+              </w:rPr>
+              <w:t>ms</w:t>
+            </w:r>
+            <w:proofErr w:type="spellEnd"/>
+            <w:r>
+              <w:rPr>
+                <w:rFonts w:ascii="Times New Roman" w:eastAsia="Times New Roman" w:hAnsi="Times New Roman" w:cs="Times New Roman"/>
+                <w:kern w:val="0"/>
+                <w:lang w:eastAsia="en-DE"/>
+                <w14:ligatures w14:val="none"/>
+              </w:rPr>
+              <w:t xml:space="preserve"> latency</w:t>
             </w:r>
           </w:p>
         </w:tc>
@@ -7321,7 +7392,27 @@
                 <w:lang w:eastAsia="en-DE"/>
                 <w14:ligatures w14:val="none"/>
               </w:rPr>
-              <w:t>≤ 100 ms delay</w:t>
+              <w:t xml:space="preserve">≤ 100 </w:t>
+            </w:r>
+            <w:proofErr w:type="spellStart"/>
+            <w:r>
+              <w:rPr>
+                <w:rFonts w:ascii="Times New Roman" w:eastAsia="Times New Roman" w:hAnsi="Times New Roman" w:cs="Times New Roman"/>
+                <w:kern w:val="0"/>
+                <w:lang w:eastAsia="en-DE"/>
+                <w14:ligatures w14:val="none"/>
+              </w:rPr>
+              <w:t>ms</w:t>
+            </w:r>
+            <w:proofErr w:type="spellEnd"/>
+            <w:r>
+              <w:rPr>
+                <w:rFonts w:ascii="Times New Roman" w:eastAsia="Times New Roman" w:hAnsi="Times New Roman" w:cs="Times New Roman"/>
+                <w:kern w:val="0"/>
+                <w:lang w:eastAsia="en-DE"/>
+                <w14:ligatures w14:val="none"/>
+              </w:rPr>
+              <w:t xml:space="preserve"> delay</w:t>
             </w:r>
           </w:p>
         </w:tc>
@@ -8952,16 +9043,7 @@
                 <w:lang w:val="en-US"/>
                 <w14:ligatures w14:val="none"/>
               </w:rPr>
-              <w:t>-</w:t>
-            </w:r>
-            <w:r>
-              <w:rPr>
-                <w:rFonts w:ascii="Times New Roman" w:eastAsia="Times New Roman" w:hAnsi="Times New Roman" w:cs="Times New Roman"/>
-                <w:kern w:val="0"/>
-                <w:lang w:val="en-US"/>
-                <w14:ligatures w14:val="none"/>
-              </w:rPr>
-              <w:t>20</w:t>
+              <w:t>-20</w:t>
             </w:r>
           </w:p>
         </w:tc>
@@ -9088,16 +9170,7 @@
                 <w:lang w:val="en-US"/>
                 <w14:ligatures w14:val="none"/>
               </w:rPr>
-              <w:t>-</w:t>
-            </w:r>
-            <w:r>
-              <w:rPr>
-                <w:rFonts w:ascii="Times New Roman" w:eastAsia="Times New Roman" w:hAnsi="Times New Roman" w:cs="Times New Roman"/>
-                <w:kern w:val="0"/>
-                <w:lang w:val="en-US"/>
-                <w14:ligatures w14:val="none"/>
-              </w:rPr>
-              <w:t>21</w:t>
+              <w:t>-21</w:t>
             </w:r>
           </w:p>
         </w:tc>
@@ -9221,16 +9294,7 @@
                 <w:lang w:val="en-US"/>
                 <w14:ligatures w14:val="none"/>
               </w:rPr>
-              <w:t>-</w:t>
-            </w:r>
-            <w:r>
-              <w:rPr>
-                <w:rFonts w:ascii="Times New Roman" w:eastAsia="Times New Roman" w:hAnsi="Times New Roman" w:cs="Times New Roman"/>
-                <w:kern w:val="0"/>
-                <w:lang w:val="en-US"/>
-                <w14:ligatures w14:val="none"/>
-              </w:rPr>
-              <w:t>22</w:t>
+              <w:t>-22</w:t>
             </w:r>
           </w:p>
         </w:tc>
@@ -9357,16 +9421,7 @@
                 <w:lang w:val="en-US"/>
                 <w14:ligatures w14:val="none"/>
               </w:rPr>
-              <w:t>-</w:t>
-            </w:r>
-            <w:r>
-              <w:rPr>
-                <w:rFonts w:ascii="Times New Roman" w:eastAsia="Times New Roman" w:hAnsi="Times New Roman" w:cs="Times New Roman"/>
-                <w:kern w:val="0"/>
-                <w:lang w:val="en-US"/>
-                <w14:ligatures w14:val="none"/>
-              </w:rPr>
-              <w:t>23</w:t>
+              <w:t>-23</w:t>
             </w:r>
           </w:p>
         </w:tc>
@@ -9490,8 +9545,25 @@
                 <w:lang w:val="en-US"/>
                 <w14:ligatures w14:val="none"/>
               </w:rPr>
-              <w:t>-</w:t>
-            </w:r>
+              <w:t>-24</w:t>
+            </w:r>
+          </w:p>
+        </w:tc>
+        <w:tc>
+          <w:tcPr>
+            <w:tcW w:w="2268" w:type="dxa"/>
+            <w:vAlign w:val="center"/>
+          </w:tcPr>
+          <w:p>
+            <w:pPr>
+              <w:cnfStyle w:val="000000000000" w:firstRow="0" w:lastRow="0" w:firstColumn="0" w:lastColumn="0" w:oddVBand="0" w:evenVBand="0" w:oddHBand="0" w:evenHBand="0" w:firstRowFirstColumn="0" w:firstRowLastColumn="0" w:lastRowFirstColumn="0" w:lastRowLastColumn="0"/>
+              <w:rPr>
+                <w:rFonts w:ascii="Times New Roman" w:eastAsia="Times New Roman" w:hAnsi="Times New Roman" w:cs="Times New Roman"/>
+                <w:kern w:val="0"/>
+                <w:lang w:eastAsia="en-DE"/>
+                <w14:ligatures w14:val="none"/>
+              </w:rPr>
+            </w:pPr>
             <w:r>
               <w:rPr>
                 <w:rFonts w:ascii="Times New Roman" w:eastAsia="Times New Roman" w:hAnsi="Times New Roman" w:cs="Times New Roman"/>
@@ -9499,13 +9571,13 @@
                 <w:lang w:val="en-US"/>
                 <w14:ligatures w14:val="none"/>
               </w:rPr>
-              <w:t>24</w:t>
-            </w:r>
-          </w:p>
-        </w:tc>
-        <w:tc>
-          <w:tcPr>
-            <w:tcW w:w="2268" w:type="dxa"/>
+              <w:t>Congestion Scheduling Time</w:t>
+            </w:r>
+          </w:p>
+        </w:tc>
+        <w:tc>
+          <w:tcPr>
+            <w:tcW w:w="3544" w:type="dxa"/>
             <w:vAlign w:val="center"/>
           </w:tcPr>
           <w:p>
@@ -9525,13 +9597,13 @@
                 <w:lang w:val="en-US"/>
                 <w14:ligatures w14:val="none"/>
               </w:rPr>
-              <w:t>Congestion Scheduling Time</w:t>
-            </w:r>
-          </w:p>
-        </w:tc>
-        <w:tc>
-          <w:tcPr>
-            <w:tcW w:w="3544" w:type="dxa"/>
+              <w:t>The controller shall continuously recompute crossing schedules during high traffic density conditions.</w:t>
+            </w:r>
+          </w:p>
+        </w:tc>
+        <w:tc>
+          <w:tcPr>
+            <w:tcW w:w="1854" w:type="dxa"/>
             <w:vAlign w:val="center"/>
           </w:tcPr>
           <w:p>
@@ -9551,25 +9623,9 @@
                 <w:lang w:val="en-US"/>
                 <w14:ligatures w14:val="none"/>
               </w:rPr>
-              <w:t>The controller shall continuously recompute crossing schedules during high traffic density conditions.</w:t>
-            </w:r>
-          </w:p>
-        </w:tc>
-        <w:tc>
-          <w:tcPr>
-            <w:tcW w:w="1854" w:type="dxa"/>
-            <w:vAlign w:val="center"/>
-          </w:tcPr>
-          <w:p>
-            <w:pPr>
-              <w:cnfStyle w:val="000000000000" w:firstRow="0" w:lastRow="0" w:firstColumn="0" w:lastColumn="0" w:oddVBand="0" w:evenVBand="0" w:oddHBand="0" w:evenHBand="0" w:firstRowFirstColumn="0" w:firstRowLastColumn="0" w:lastRowFirstColumn="0" w:lastRowLastColumn="0"/>
-              <w:rPr>
-                <w:rFonts w:ascii="Times New Roman" w:eastAsia="Times New Roman" w:hAnsi="Times New Roman" w:cs="Times New Roman"/>
-                <w:kern w:val="0"/>
-                <w:lang w:eastAsia="en-DE"/>
-                <w14:ligatures w14:val="none"/>
-              </w:rPr>
-            </w:pPr>
+              <w:t xml:space="preserve">Dynamic schedule </w:t>
+            </w:r>
+            <w:proofErr w:type="spellStart"/>
             <w:r>
               <w:rPr>
                 <w:rFonts w:ascii="Times New Roman" w:eastAsia="Times New Roman" w:hAnsi="Times New Roman" w:cs="Times New Roman"/>
@@ -9577,7 +9633,17 @@
                 <w:lang w:val="en-US"/>
                 <w14:ligatures w14:val="none"/>
               </w:rPr>
-              <w:t>Dynamic schedule recomputation within operational deadline</w:t>
+              <w:t>recomputation</w:t>
+            </w:r>
+            <w:proofErr w:type="spellEnd"/>
+            <w:r>
+              <w:rPr>
+                <w:rFonts w:ascii="Times New Roman" w:eastAsia="Times New Roman" w:hAnsi="Times New Roman" w:cs="Times New Roman"/>
+                <w:kern w:val="0"/>
+                <w:lang w:val="en-US"/>
+                <w14:ligatures w14:val="none"/>
+              </w:rPr>
+              <w:t xml:space="preserve"> within operational deadline</w:t>
             </w:r>
           </w:p>
         </w:tc>
@@ -10076,14 +10142,25 @@
                 <w14:ligatures w14:val="none"/>
               </w:rPr>
             </w:pPr>
-            <w:r>
-              <w:rPr>
-                <w:rFonts w:ascii="Times New Roman" w:eastAsia="Times New Roman" w:hAnsi="Times New Roman" w:cs="Times New Roman"/>
-                <w:kern w:val="0"/>
-                <w:lang w:eastAsia="en-DE"/>
-                <w14:ligatures w14:val="none"/>
-              </w:rPr>
-              <w:t>LaneState consistency checks</w:t>
+            <w:proofErr w:type="spellStart"/>
+            <w:r>
+              <w:rPr>
+                <w:rFonts w:ascii="Times New Roman" w:eastAsia="Times New Roman" w:hAnsi="Times New Roman" w:cs="Times New Roman"/>
+                <w:kern w:val="0"/>
+                <w:lang w:eastAsia="en-DE"/>
+                <w14:ligatures w14:val="none"/>
+              </w:rPr>
+              <w:t>LaneState</w:t>
+            </w:r>
+            <w:proofErr w:type="spellEnd"/>
+            <w:r>
+              <w:rPr>
+                <w:rFonts w:ascii="Times New Roman" w:eastAsia="Times New Roman" w:hAnsi="Times New Roman" w:cs="Times New Roman"/>
+                <w:kern w:val="0"/>
+                <w:lang w:eastAsia="en-DE"/>
+                <w14:ligatures w14:val="none"/>
+              </w:rPr>
+              <w:t xml:space="preserve"> consistency checks</w:t>
             </w:r>
           </w:p>
         </w:tc>
@@ -10354,14 +10431,25 @@
                 <w14:ligatures w14:val="none"/>
               </w:rPr>
             </w:pPr>
-            <w:r>
-              <w:rPr>
-                <w:rFonts w:ascii="Times New Roman" w:eastAsia="Times New Roman" w:hAnsi="Times New Roman" w:cs="Times New Roman"/>
-                <w:kern w:val="0"/>
-                <w:lang w:eastAsia="en-DE"/>
-                <w14:ligatures w14:val="none"/>
-              </w:rPr>
-              <w:t>ConflictGraph correctness checks</w:t>
+            <w:proofErr w:type="spellStart"/>
+            <w:r>
+              <w:rPr>
+                <w:rFonts w:ascii="Times New Roman" w:eastAsia="Times New Roman" w:hAnsi="Times New Roman" w:cs="Times New Roman"/>
+                <w:kern w:val="0"/>
+                <w:lang w:eastAsia="en-DE"/>
+                <w14:ligatures w14:val="none"/>
+              </w:rPr>
+              <w:t>ConflictGraph</w:t>
+            </w:r>
+            <w:proofErr w:type="spellEnd"/>
+            <w:r>
+              <w:rPr>
+                <w:rFonts w:ascii="Times New Roman" w:eastAsia="Times New Roman" w:hAnsi="Times New Roman" w:cs="Times New Roman"/>
+                <w:kern w:val="0"/>
+                <w:lang w:eastAsia="en-DE"/>
+                <w14:ligatures w14:val="none"/>
+              </w:rPr>
+              <w:t xml:space="preserve"> correctness checks</w:t>
             </w:r>
           </w:p>
         </w:tc>
@@ -11522,7 +11610,27 @@
                 <w:lang w:eastAsia="en-DE"/>
                 <w14:ligatures w14:val="none"/>
               </w:rPr>
-              <w:t>≤ 50 ms response</w:t>
+              <w:t xml:space="preserve">≤ 50 </w:t>
+            </w:r>
+            <w:proofErr w:type="spellStart"/>
+            <w:r>
+              <w:rPr>
+                <w:rFonts w:ascii="Times New Roman" w:eastAsia="Times New Roman" w:hAnsi="Times New Roman" w:cs="Times New Roman"/>
+                <w:kern w:val="0"/>
+                <w:lang w:eastAsia="en-DE"/>
+                <w14:ligatures w14:val="none"/>
+              </w:rPr>
+              <w:t>ms</w:t>
+            </w:r>
+            <w:proofErr w:type="spellEnd"/>
+            <w:r>
+              <w:rPr>
+                <w:rFonts w:ascii="Times New Roman" w:eastAsia="Times New Roman" w:hAnsi="Times New Roman" w:cs="Times New Roman"/>
+                <w:kern w:val="0"/>
+                <w:lang w:eastAsia="en-DE"/>
+                <w14:ligatures w14:val="none"/>
+              </w:rPr>
+              <w:t xml:space="preserve"> response</w:t>
             </w:r>
           </w:p>
         </w:tc>
@@ -12213,7 +12321,27 @@
                 <w:lang w:eastAsia="en-DE"/>
                 <w14:ligatures w14:val="none"/>
               </w:rPr>
-              <w:t>≤ 100 ms delay tolerance</w:t>
+              <w:t xml:space="preserve">≤ 100 </w:t>
+            </w:r>
+            <w:proofErr w:type="spellStart"/>
+            <w:r>
+              <w:rPr>
+                <w:rFonts w:ascii="Times New Roman" w:eastAsia="Times New Roman" w:hAnsi="Times New Roman" w:cs="Times New Roman"/>
+                <w:kern w:val="0"/>
+                <w:lang w:eastAsia="en-DE"/>
+                <w14:ligatures w14:val="none"/>
+              </w:rPr>
+              <w:t>ms</w:t>
+            </w:r>
+            <w:proofErr w:type="spellEnd"/>
+            <w:r>
+              <w:rPr>
+                <w:rFonts w:ascii="Times New Roman" w:eastAsia="Times New Roman" w:hAnsi="Times New Roman" w:cs="Times New Roman"/>
+                <w:kern w:val="0"/>
+                <w:lang w:eastAsia="en-DE"/>
+                <w14:ligatures w14:val="none"/>
+              </w:rPr>
+              <w:t xml:space="preserve"> delay tolerance</w:t>
             </w:r>
           </w:p>
         </w:tc>
@@ -12879,16 +13007,7 @@
                 <w:lang w:eastAsia="en-DE"/>
                 <w14:ligatures w14:val="none"/>
               </w:rPr>
-              <w:t>NFR</w:t>
-            </w:r>
-            <w:r>
-              <w:rPr>
-                <w:rFonts w:ascii="Times New Roman" w:eastAsia="Times New Roman" w:hAnsi="Times New Roman" w:cs="Times New Roman"/>
-                <w:kern w:val="0"/>
-                <w:lang w:eastAsia="en-DE"/>
-                <w14:ligatures w14:val="none"/>
-              </w:rPr>
-              <w:t>-11</w:t>
+              <w:t>NFR-11</w:t>
             </w:r>
           </w:p>
         </w:tc>
@@ -13090,7 +13209,27 @@
                 <w:lang w:eastAsia="en-DE"/>
                 <w14:ligatures w14:val="none"/>
               </w:rPr>
-              <w:t>≤ 10–50 ms scheduling WCET</w:t>
+              <w:t xml:space="preserve">≤ 10–50 </w:t>
+            </w:r>
+            <w:proofErr w:type="spellStart"/>
+            <w:r>
+              <w:rPr>
+                <w:rFonts w:ascii="Times New Roman" w:eastAsia="Times New Roman" w:hAnsi="Times New Roman" w:cs="Times New Roman"/>
+                <w:kern w:val="0"/>
+                <w:lang w:eastAsia="en-DE"/>
+                <w14:ligatures w14:val="none"/>
+              </w:rPr>
+              <w:t>ms</w:t>
+            </w:r>
+            <w:proofErr w:type="spellEnd"/>
+            <w:r>
+              <w:rPr>
+                <w:rFonts w:ascii="Times New Roman" w:eastAsia="Times New Roman" w:hAnsi="Times New Roman" w:cs="Times New Roman"/>
+                <w:kern w:val="0"/>
+                <w:lang w:eastAsia="en-DE"/>
+                <w14:ligatures w14:val="none"/>
+              </w:rPr>
+              <w:t xml:space="preserve"> scheduling WCET</w:t>
             </w:r>
           </w:p>
         </w:tc>
@@ -13520,8 +13659,19 @@
                 <w:lang w:eastAsia="en-DE"/>
                 <w14:ligatures w14:val="none"/>
               </w:rPr>
-              <w:t>Emergency Preemption</w:t>
-            </w:r>
+              <w:t xml:space="preserve">Emergency </w:t>
+            </w:r>
+            <w:proofErr w:type="spellStart"/>
+            <w:r>
+              <w:rPr>
+                <w:rFonts w:ascii="Times New Roman" w:eastAsia="Times New Roman" w:hAnsi="Times New Roman" w:cs="Times New Roman"/>
+                <w:kern w:val="0"/>
+                <w:lang w:eastAsia="en-DE"/>
+                <w14:ligatures w14:val="none"/>
+              </w:rPr>
+              <w:t>Preemption</w:t>
+            </w:r>
+            <w:proofErr w:type="spellEnd"/>
           </w:p>
         </w:tc>
         <w:tc>
@@ -17957,7 +18107,27 @@
           <w:lang w:eastAsia="en-DE"/>
           <w14:ligatures w14:val="none"/>
         </w:rPr>
-        <w:t xml:space="preserve">Suitability for FreeRTOS implementation </w:t>
+        <w:t xml:space="preserve">Suitability for </w:t>
+      </w:r>
+      <w:proofErr w:type="spellStart"/>
+      <w:r>
+        <w:rPr>
+          <w:rFonts w:ascii="Times New Roman" w:eastAsia="Times New Roman" w:hAnsi="Times New Roman" w:cs="Times New Roman"/>
+          <w:kern w:val="0"/>
+          <w:lang w:eastAsia="en-DE"/>
+          <w14:ligatures w14:val="none"/>
+        </w:rPr>
+        <w:t>FreeRTOS</w:t>
+      </w:r>
+      <w:proofErr w:type="spellEnd"/>
+      <w:r>
+        <w:rPr>
+          <w:rFonts w:ascii="Times New Roman" w:eastAsia="Times New Roman" w:hAnsi="Times New Roman" w:cs="Times New Roman"/>
+          <w:kern w:val="0"/>
+          <w:lang w:eastAsia="en-DE"/>
+          <w14:ligatures w14:val="none"/>
+        </w:rPr>
+        <w:t xml:space="preserve"> implementation </w:t>
       </w:r>
     </w:p>
     <w:p>
@@ -18410,7 +18580,15 @@
         <w:t>analysed</w:t>
       </w:r>
       <w:r>
-        <w:t xml:space="preserve"> for timing constraints, correctness, and resource usage, enabling formal methods such as UPPAAL to be applied more effectively. It also allows direct mapping to RTOS task structures, improving schedulability analysis and implementation feasibility on embedded platforms. Overall, while monolithic controllers may be simpler initially, the BDD-based modular architecture provides stronger guarantees in terms of safety, scalability, verifiability, and requirement traceability, which are essential for intelligent intersection systems.</w:t>
+        <w:t xml:space="preserve"> for timing constraints, correctness, and resource usage, enabling formal methods such as UPPAAL to be applied more effectively. It also allows direct mapping to RTOS task structures, improving </w:t>
+      </w:r>
+      <w:proofErr w:type="spellStart"/>
+      <w:r>
+        <w:t>schedulability</w:t>
+      </w:r>
+      <w:proofErr w:type="spellEnd"/>
+      <w:r>
+        <w:t xml:space="preserve"> analysis and implementation feasibility on embedded platforms. Overall, while monolithic controllers may be simpler initially, the BDD-based modular architecture provides stronger guarantees in terms of safety, scalability, verifiability, and requirement traceability, which are essential for intelligent intersection systems.</w:t>
       </w:r>
     </w:p>
     <w:p>
@@ -18592,6 +18770,54 @@
     <w:p>
       <w:pPr>
         <w:spacing w:before="100" w:beforeAutospacing="1" w:after="100" w:afterAutospacing="1" w:line="240" w:lineRule="auto"/>
+        <w:outlineLvl w:val="2"/>
+        <w:rPr>
+          <w:rFonts w:ascii="Times New Roman" w:eastAsia="Times New Roman" w:hAnsi="Times New Roman" w:cs="Times New Roman"/>
+          <w:b/>
+          <w:bCs/>
+          <w:kern w:val="0"/>
+          <w:sz w:val="27"/>
+          <w:szCs w:val="27"/>
+          <w:lang w:eastAsia="en-DE"/>
+          <w14:ligatures w14:val="none"/>
+        </w:rPr>
+      </w:pPr>
+    </w:p>
+    <w:p>
+      <w:pPr>
+        <w:spacing w:before="100" w:beforeAutospacing="1" w:after="100" w:afterAutospacing="1" w:line="240" w:lineRule="auto"/>
+        <w:outlineLvl w:val="2"/>
+        <w:rPr>
+          <w:rFonts w:ascii="Times New Roman" w:eastAsia="Times New Roman" w:hAnsi="Times New Roman" w:cs="Times New Roman"/>
+          <w:b/>
+          <w:bCs/>
+          <w:kern w:val="0"/>
+          <w:sz w:val="27"/>
+          <w:szCs w:val="27"/>
+          <w:lang w:eastAsia="en-DE"/>
+          <w14:ligatures w14:val="none"/>
+        </w:rPr>
+      </w:pPr>
+    </w:p>
+    <w:p>
+      <w:pPr>
+        <w:spacing w:before="100" w:beforeAutospacing="1" w:after="100" w:afterAutospacing="1" w:line="240" w:lineRule="auto"/>
+        <w:outlineLvl w:val="2"/>
+        <w:rPr>
+          <w:rFonts w:ascii="Times New Roman" w:eastAsia="Times New Roman" w:hAnsi="Times New Roman" w:cs="Times New Roman"/>
+          <w:b/>
+          <w:bCs/>
+          <w:kern w:val="0"/>
+          <w:sz w:val="27"/>
+          <w:szCs w:val="27"/>
+          <w:lang w:eastAsia="en-DE"/>
+          <w14:ligatures w14:val="none"/>
+        </w:rPr>
+      </w:pPr>
+    </w:p>
+    <w:p>
+      <w:pPr>
+        <w:spacing w:before="100" w:beforeAutospacing="1" w:after="100" w:afterAutospacing="1" w:line="240" w:lineRule="auto"/>
         <w:outlineLvl w:val="1"/>
         <w:rPr>
           <w:rFonts w:ascii="Times New Roman" w:eastAsia="Times New Roman" w:hAnsi="Times New Roman" w:cs="Times New Roman"/>
@@ -18615,6 +18841,7 @@
           <w:lang w:eastAsia="en-DE"/>
           <w14:ligatures w14:val="none"/>
         </w:rPr>
+        <w:lastRenderedPageBreak/>
         <w:t>3.</w:t>
       </w:r>
       <w:r>
@@ -18684,7 +18911,6 @@
           <w:lang w:eastAsia="en-DE"/>
           <w14:ligatures w14:val="none"/>
         </w:rPr>
-        <w:lastRenderedPageBreak/>
         <w:drawing>
           <wp:anchor distT="0" distB="0" distL="114300" distR="114300" simplePos="0" relativeHeight="251669504" behindDoc="0" locked="0" layoutInCell="1" allowOverlap="1" wp14:anchorId="427F649D" wp14:editId="06CD742B">
             <wp:simplePos x="0" y="0"/>
@@ -18845,6 +19071,7 @@
           <w:lang w:eastAsia="en-DE"/>
           <w14:ligatures w14:val="none"/>
         </w:rPr>
+        <w:lastRenderedPageBreak/>
         <w:t>Behavioural</w:t>
       </w:r>
       <w:r>
@@ -18887,7 +19114,6 @@
           <w:lang w:eastAsia="en-DE"/>
           <w14:ligatures w14:val="none"/>
         </w:rPr>
-        <w:lastRenderedPageBreak/>
         <w:t>3.</w:t>
       </w:r>
       <w:r>
@@ -19385,7 +19611,47 @@
           <w:lang w:eastAsia="en-DE"/>
           <w14:ligatures w14:val="none"/>
         </w:rPr>
-        <w:t>The Vehicle Processing Sequence describes the normal operation of the smart intersection controller from vehicle arrival to movement execution. The sequence begins when vehicle state and intent information are received through sensors and V2X communication. The Sensor Subsystem collects the raw data and forwards it to the Lane State Builder, which constructs a structured LaneState representing the current traffic situation. This information is stored in the Global State Manager and passed to the Conflict Detection Engine, where potential conflicts between vehicle trajectories are identified. If conflicts exist, the Arbitration Manager applies priority and safety rules to generate a SafeConstraintSet; otherwise, default constraints are used.</w:t>
+        <w:t xml:space="preserve">The Vehicle Processing Sequence describes the normal operation of the smart intersection controller from vehicle arrival to movement execution. The sequence begins when vehicle state and intent information are received through sensors and V2X communication. The Sensor Subsystem collects the raw data and forwards it to the Lane State Builder, which constructs a structured </w:t>
+      </w:r>
+      <w:proofErr w:type="spellStart"/>
+      <w:r>
+        <w:rPr>
+          <w:rFonts w:ascii="Times New Roman" w:eastAsia="Times New Roman" w:hAnsi="Times New Roman" w:cs="Times New Roman"/>
+          <w:kern w:val="0"/>
+          <w:lang w:eastAsia="en-DE"/>
+          <w14:ligatures w14:val="none"/>
+        </w:rPr>
+        <w:t>LaneState</w:t>
+      </w:r>
+      <w:proofErr w:type="spellEnd"/>
+      <w:r>
+        <w:rPr>
+          <w:rFonts w:ascii="Times New Roman" w:eastAsia="Times New Roman" w:hAnsi="Times New Roman" w:cs="Times New Roman"/>
+          <w:kern w:val="0"/>
+          <w:lang w:eastAsia="en-DE"/>
+          <w14:ligatures w14:val="none"/>
+        </w:rPr>
+        <w:t xml:space="preserve"> representing the current traffic situation. This information is stored in the Global State Manager and passed to the Conflict Detection Engine, where potential conflicts between vehicle trajectories are identified. If conflicts exist, the Arbitration Manager applies priority and safety rules to generate a </w:t>
+      </w:r>
+      <w:proofErr w:type="spellStart"/>
+      <w:r>
+        <w:rPr>
+          <w:rFonts w:ascii="Times New Roman" w:eastAsia="Times New Roman" w:hAnsi="Times New Roman" w:cs="Times New Roman"/>
+          <w:kern w:val="0"/>
+          <w:lang w:eastAsia="en-DE"/>
+          <w14:ligatures w14:val="none"/>
+        </w:rPr>
+        <w:t>SafeConstraintSet</w:t>
+      </w:r>
+      <w:proofErr w:type="spellEnd"/>
+      <w:r>
+        <w:rPr>
+          <w:rFonts w:ascii="Times New Roman" w:eastAsia="Times New Roman" w:hAnsi="Times New Roman" w:cs="Times New Roman"/>
+          <w:kern w:val="0"/>
+          <w:lang w:eastAsia="en-DE"/>
+          <w14:ligatures w14:val="none"/>
+        </w:rPr>
+        <w:t>; otherwise, default constraints are used.</w:t>
       </w:r>
     </w:p>
     <w:p>
@@ -19407,7 +19673,27 @@
           <w14:ligatures w14:val="none"/>
         </w:rPr>
         <w:lastRenderedPageBreak/>
-        <w:t>Using the available constraints, the Scheduling Engine generates a SchedulePlan that defines the temporal order and reservation of intersection resources. The Verification Module then validates the generated schedule against safety, timing, and consistency requirements. If the schedule is invalid, a replanning process is triggered until a valid schedule is produced. Once approved, the Reservation Manager commits the schedule and creates active reservations. The Vehicle Interface subsequently issues movement commands to the vehicles and receives execution feedback. Finally, the execution results are stored in the Global State Manager, completing the control cycle and providing an updated system state for the next scheduling iteration.</w:t>
+        <w:t xml:space="preserve">Using the available constraints, the Scheduling Engine generates a </w:t>
+      </w:r>
+      <w:proofErr w:type="spellStart"/>
+      <w:r>
+        <w:rPr>
+          <w:rFonts w:ascii="Times New Roman" w:eastAsia="Times New Roman" w:hAnsi="Times New Roman" w:cs="Times New Roman"/>
+          <w:kern w:val="0"/>
+          <w:lang w:eastAsia="en-DE"/>
+          <w14:ligatures w14:val="none"/>
+        </w:rPr>
+        <w:t>SchedulePlan</w:t>
+      </w:r>
+      <w:proofErr w:type="spellEnd"/>
+      <w:r>
+        <w:rPr>
+          <w:rFonts w:ascii="Times New Roman" w:eastAsia="Times New Roman" w:hAnsi="Times New Roman" w:cs="Times New Roman"/>
+          <w:kern w:val="0"/>
+          <w:lang w:eastAsia="en-DE"/>
+          <w14:ligatures w14:val="none"/>
+        </w:rPr>
+        <w:t xml:space="preserve"> that defines the temporal order and reservation of intersection resources. The Verification Module then validates the generated schedule against safety, timing, and consistency requirements. If the schedule is invalid, a replanning process is triggered until a valid schedule is produced. Once approved, the Reservation Manager commits the schedule and creates active reservations. The Vehicle Interface subsequently issues movement commands to the vehicles and receives execution feedback. Finally, the execution results are stored in the Global State Manager, completing the control cycle and providing an updated system state for the next scheduling iteration.</w:t>
       </w:r>
     </w:p>
     <w:p>
@@ -20038,7 +20324,7 @@
           <w:kern w:val="0"/>
           <w:sz w:val="36"/>
           <w:szCs w:val="36"/>
-          <w:lang w:eastAsia="en-DE"/>
+          <w:lang w:val="en-DE" w:eastAsia="en-DE"/>
           <w14:ligatures w14:val="none"/>
         </w:rPr>
       </w:pPr>
@@ -20050,16 +20336,2182 @@
           <w:kern w:val="0"/>
           <w:sz w:val="36"/>
           <w:szCs w:val="36"/>
-          <w:lang w:eastAsia="en-DE"/>
-          <w14:ligatures w14:val="none"/>
-        </w:rPr>
-        <w:t>5.1 Fixed-Time Scheduling</w:t>
+          <w:lang w:val="en-DE" w:eastAsia="en-DE"/>
+          <w14:ligatures w14:val="none"/>
+        </w:rPr>
+        <w:t>Design Rationale and Trade-Off Analysis</w:t>
       </w:r>
     </w:p>
     <w:p>
       <w:pPr>
         <w:spacing w:before="100" w:beforeAutospacing="1" w:after="100" w:afterAutospacing="1" w:line="240" w:lineRule="auto"/>
-        <w:outlineLvl w:val="1"/>
+        <w:outlineLvl w:val="2"/>
+        <w:rPr>
+          <w:rFonts w:ascii="Times New Roman" w:eastAsia="Times New Roman" w:hAnsi="Times New Roman" w:cs="Times New Roman"/>
+          <w:b/>
+          <w:bCs/>
+          <w:kern w:val="0"/>
+          <w:sz w:val="27"/>
+          <w:szCs w:val="27"/>
+          <w:lang w:val="en-DE" w:eastAsia="en-DE"/>
+          <w14:ligatures w14:val="none"/>
+        </w:rPr>
+      </w:pPr>
+      <w:r>
+        <w:rPr>
+          <w:rFonts w:ascii="Times New Roman" w:eastAsia="Times New Roman" w:hAnsi="Times New Roman" w:cs="Times New Roman"/>
+          <w:b/>
+          <w:bCs/>
+          <w:kern w:val="0"/>
+          <w:sz w:val="27"/>
+          <w:szCs w:val="27"/>
+          <w:lang w:val="en-DE" w:eastAsia="en-DE"/>
+          <w14:ligatures w14:val="none"/>
+        </w:rPr>
+        <w:t>1. System Objective and Problem Class</w:t>
+      </w:r>
+    </w:p>
+    <w:p>
+      <w:pPr>
+        <w:spacing w:before="100" w:beforeAutospacing="1" w:after="100" w:afterAutospacing="1" w:line="240" w:lineRule="auto"/>
+        <w:jc w:val="both"/>
+        <w:rPr>
+          <w:rFonts w:ascii="Times New Roman" w:eastAsia="Times New Roman" w:hAnsi="Times New Roman" w:cs="Times New Roman"/>
+          <w:kern w:val="0"/>
+          <w:lang w:val="en-DE" w:eastAsia="en-DE"/>
+          <w14:ligatures w14:val="none"/>
+        </w:rPr>
+      </w:pPr>
+      <w:r>
+        <w:rPr>
+          <w:rFonts w:ascii="Times New Roman" w:eastAsia="Times New Roman" w:hAnsi="Times New Roman" w:cs="Times New Roman"/>
+          <w:kern w:val="0"/>
+          <w:lang w:val="en-DE" w:eastAsia="en-DE"/>
+          <w14:ligatures w14:val="none"/>
+        </w:rPr>
+        <w:t xml:space="preserve">The intersection management system addresses a dynamic, safety-critical scheduling problem in which vehicles with heterogeneous movement intents must be coordinated over shared spatial resources under strict real-time constraints. The problem can be formally interpreted as a </w:t>
+      </w:r>
+      <w:r>
+        <w:rPr>
+          <w:rFonts w:ascii="Times New Roman" w:eastAsia="Times New Roman" w:hAnsi="Times New Roman" w:cs="Times New Roman"/>
+          <w:b/>
+          <w:bCs/>
+          <w:kern w:val="0"/>
+          <w:lang w:val="en-DE" w:eastAsia="en-DE"/>
+          <w14:ligatures w14:val="none"/>
+        </w:rPr>
+        <w:t>dynamic, weighted, conflict-constrained resource allocation problem</w:t>
+      </w:r>
+      <w:r>
+        <w:rPr>
+          <w:rFonts w:ascii="Times New Roman" w:eastAsia="Times New Roman" w:hAnsi="Times New Roman" w:cs="Times New Roman"/>
+          <w:kern w:val="0"/>
+          <w:lang w:val="en-DE" w:eastAsia="en-DE"/>
+          <w14:ligatures w14:val="none"/>
+        </w:rPr>
+        <w:t xml:space="preserve"> with hard safety requirements and bounded execution deadlines.</w:t>
+      </w:r>
+      <w:r>
+        <w:rPr>
+          <w:rFonts w:ascii="Times New Roman" w:eastAsia="Times New Roman" w:hAnsi="Times New Roman" w:cs="Times New Roman"/>
+          <w:kern w:val="0"/>
+          <w:lang w:val="en-DE" w:eastAsia="en-DE"/>
+          <w14:ligatures w14:val="none"/>
+        </w:rPr>
+        <w:t xml:space="preserve"> </w:t>
+      </w:r>
+      <w:r>
+        <w:rPr>
+          <w:rFonts w:ascii="Times New Roman" w:eastAsia="Times New Roman" w:hAnsi="Times New Roman" w:cs="Times New Roman"/>
+          <w:kern w:val="0"/>
+          <w:lang w:val="en-DE" w:eastAsia="en-DE"/>
+          <w14:ligatures w14:val="none"/>
+        </w:rPr>
+        <w:t xml:space="preserve">The primary objective is not global performance optimization, but the construction of a </w:t>
+      </w:r>
+      <w:r>
+        <w:rPr>
+          <w:rFonts w:ascii="Times New Roman" w:eastAsia="Times New Roman" w:hAnsi="Times New Roman" w:cs="Times New Roman"/>
+          <w:b/>
+          <w:bCs/>
+          <w:kern w:val="0"/>
+          <w:lang w:val="en-DE" w:eastAsia="en-DE"/>
+          <w14:ligatures w14:val="none"/>
+        </w:rPr>
+        <w:t>feasible, conflict-free, and temporally bounded schedule</w:t>
+      </w:r>
+      <w:r>
+        <w:rPr>
+          <w:rFonts w:ascii="Times New Roman" w:eastAsia="Times New Roman" w:hAnsi="Times New Roman" w:cs="Times New Roman"/>
+          <w:kern w:val="0"/>
+          <w:lang w:val="en-DE" w:eastAsia="en-DE"/>
+          <w14:ligatures w14:val="none"/>
+        </w:rPr>
+        <w:t xml:space="preserve"> that satisfies all safety constraints while remaining computationally tractable for real-time embedded execution and formal verification.</w:t>
+      </w:r>
+      <w:r>
+        <w:rPr>
+          <w:rFonts w:ascii="Times New Roman" w:eastAsia="Times New Roman" w:hAnsi="Times New Roman" w:cs="Times New Roman"/>
+          <w:kern w:val="0"/>
+          <w:lang w:val="en-DE" w:eastAsia="en-DE"/>
+          <w14:ligatures w14:val="none"/>
+        </w:rPr>
+        <w:t xml:space="preserve"> </w:t>
+      </w:r>
+      <w:r>
+        <w:rPr>
+          <w:rFonts w:ascii="Times New Roman" w:eastAsia="Times New Roman" w:hAnsi="Times New Roman" w:cs="Times New Roman"/>
+          <w:kern w:val="0"/>
+          <w:lang w:val="en-DE" w:eastAsia="en-DE"/>
+          <w14:ligatures w14:val="none"/>
+        </w:rPr>
+        <w:t>This places the problem in a class where exact optimal scheduling (e.g., maximum-weight independent set over a dynamic conflict graph with temporal constraints) is computationally intractable in general cases and incompatible with model-checking requirements.</w:t>
+      </w:r>
+    </w:p>
+    <w:p>
+      <w:pPr>
+        <w:spacing w:before="100" w:beforeAutospacing="1" w:after="100" w:afterAutospacing="1" w:line="240" w:lineRule="auto"/>
+        <w:outlineLvl w:val="2"/>
+        <w:rPr>
+          <w:rFonts w:ascii="Times New Roman" w:eastAsia="Times New Roman" w:hAnsi="Times New Roman" w:cs="Times New Roman"/>
+          <w:b/>
+          <w:bCs/>
+          <w:kern w:val="0"/>
+          <w:sz w:val="27"/>
+          <w:szCs w:val="27"/>
+          <w:lang w:val="en-DE" w:eastAsia="en-DE"/>
+          <w14:ligatures w14:val="none"/>
+        </w:rPr>
+      </w:pPr>
+      <w:r>
+        <w:rPr>
+          <w:rFonts w:ascii="Times New Roman" w:eastAsia="Times New Roman" w:hAnsi="Times New Roman" w:cs="Times New Roman"/>
+          <w:b/>
+          <w:bCs/>
+          <w:kern w:val="0"/>
+          <w:sz w:val="27"/>
+          <w:szCs w:val="27"/>
+          <w:lang w:val="en-DE" w:eastAsia="en-DE"/>
+          <w14:ligatures w14:val="none"/>
+        </w:rPr>
+        <w:lastRenderedPageBreak/>
+        <w:t>2. Design Rationale of the Greedy Scheduling Approach</w:t>
+      </w:r>
+    </w:p>
+    <w:p>
+      <w:pPr>
+        <w:spacing w:before="100" w:beforeAutospacing="1" w:after="100" w:afterAutospacing="1" w:line="240" w:lineRule="auto"/>
+        <w:jc w:val="both"/>
+        <w:rPr>
+          <w:rFonts w:ascii="Times New Roman" w:eastAsia="Times New Roman" w:hAnsi="Times New Roman" w:cs="Times New Roman"/>
+          <w:kern w:val="0"/>
+          <w:lang w:val="en-DE" w:eastAsia="en-DE"/>
+          <w14:ligatures w14:val="none"/>
+        </w:rPr>
+      </w:pPr>
+      <w:r>
+        <w:rPr>
+          <w:rFonts w:ascii="Times New Roman" w:eastAsia="Times New Roman" w:hAnsi="Times New Roman" w:cs="Times New Roman"/>
+          <w:kern w:val="0"/>
+          <w:lang w:val="en-DE" w:eastAsia="en-DE"/>
+          <w14:ligatures w14:val="none"/>
+        </w:rPr>
+        <w:t xml:space="preserve">The adopted scheduling strategy is based on a </w:t>
+      </w:r>
+      <w:r>
+        <w:rPr>
+          <w:rFonts w:ascii="Times New Roman" w:eastAsia="Times New Roman" w:hAnsi="Times New Roman" w:cs="Times New Roman"/>
+          <w:b/>
+          <w:bCs/>
+          <w:kern w:val="0"/>
+          <w:lang w:val="en-DE" w:eastAsia="en-DE"/>
+          <w14:ligatures w14:val="none"/>
+        </w:rPr>
+        <w:t>greedy, priority-weighted selection mechanism augmented with aging-based fairness and cost-aware biasing</w:t>
+      </w:r>
+      <w:r>
+        <w:rPr>
+          <w:rFonts w:ascii="Times New Roman" w:eastAsia="Times New Roman" w:hAnsi="Times New Roman" w:cs="Times New Roman"/>
+          <w:kern w:val="0"/>
+          <w:lang w:val="en-DE" w:eastAsia="en-DE"/>
+          <w14:ligatures w14:val="none"/>
+        </w:rPr>
+        <w:t>. At each scheduling cycle, each vehicle request is assigned a dynamic priority score:</w:t>
+      </w:r>
+    </w:p>
+    <w:p>
+      <w:pPr>
+        <w:spacing w:before="100" w:beforeAutospacing="1" w:after="100" w:afterAutospacing="1" w:line="240" w:lineRule="auto"/>
+        <w:rPr>
+          <w:rFonts w:ascii="Times New Roman" w:eastAsia="Times New Roman" w:hAnsi="Times New Roman" w:cs="Times New Roman"/>
+          <w:kern w:val="0"/>
+          <w:lang w:val="en-DE" w:eastAsia="en-DE"/>
+          <w14:ligatures w14:val="none"/>
+        </w:rPr>
+      </w:pPr>
+      <m:oMathPara>
+        <m:oMath>
+          <m:r>
+            <w:rPr>
+              <w:rFonts w:ascii="Cambria Math" w:eastAsia="Times New Roman" w:hAnsi="Cambria Math" w:cs="Times New Roman"/>
+              <w:kern w:val="0"/>
+              <w:lang w:val="en-DE" w:eastAsia="en-DE"/>
+              <w14:ligatures w14:val="none"/>
+            </w:rPr>
+            <m:t>Scor</m:t>
+          </m:r>
+          <m:sSub>
+            <m:sSubPr>
+              <m:ctrlPr>
+                <w:rPr>
+                  <w:rFonts w:ascii="Cambria Math" w:eastAsia="Times New Roman" w:hAnsi="Cambria Math" w:cs="Times New Roman"/>
+                  <w:i/>
+                  <w:kern w:val="0"/>
+                  <w:lang w:val="en-DE" w:eastAsia="en-DE"/>
+                  <w14:ligatures w14:val="none"/>
+                </w:rPr>
+              </m:ctrlPr>
+            </m:sSubPr>
+            <m:e>
+              <m:r>
+                <w:rPr>
+                  <w:rFonts w:ascii="Cambria Math" w:eastAsia="Times New Roman" w:hAnsi="Cambria Math" w:cs="Times New Roman"/>
+                  <w:kern w:val="0"/>
+                  <w:lang w:val="en-DE" w:eastAsia="en-DE"/>
+                  <w14:ligatures w14:val="none"/>
+                </w:rPr>
+                <m:t>e</m:t>
+              </m:r>
+            </m:e>
+            <m:sub>
+              <m:r>
+                <w:rPr>
+                  <w:rFonts w:ascii="Cambria Math" w:eastAsia="Times New Roman" w:hAnsi="Cambria Math" w:cs="Times New Roman"/>
+                  <w:kern w:val="0"/>
+                  <w:lang w:val="en-DE" w:eastAsia="en-DE"/>
+                  <w14:ligatures w14:val="none"/>
+                </w:rPr>
+                <m:t>i</m:t>
+              </m:r>
+            </m:sub>
+          </m:sSub>
+          <m:r>
+            <w:rPr>
+              <w:rFonts w:ascii="Cambria Math" w:eastAsia="Times New Roman" w:hAnsi="Cambria Math" w:cs="Times New Roman"/>
+              <w:kern w:val="0"/>
+              <w:lang w:val="en-DE" w:eastAsia="en-DE"/>
+              <w14:ligatures w14:val="none"/>
+            </w:rPr>
+            <m:t>= waitTim</m:t>
+          </m:r>
+          <m:sSub>
+            <m:sSubPr>
+              <m:ctrlPr>
+                <w:rPr>
+                  <w:rFonts w:ascii="Cambria Math" w:eastAsia="Times New Roman" w:hAnsi="Cambria Math" w:cs="Times New Roman"/>
+                  <w:i/>
+                  <w:kern w:val="0"/>
+                  <w:lang w:val="en-DE" w:eastAsia="en-DE"/>
+                  <w14:ligatures w14:val="none"/>
+                </w:rPr>
+              </m:ctrlPr>
+            </m:sSubPr>
+            <m:e>
+              <m:r>
+                <w:rPr>
+                  <w:rFonts w:ascii="Cambria Math" w:eastAsia="Times New Roman" w:hAnsi="Cambria Math" w:cs="Times New Roman"/>
+                  <w:kern w:val="0"/>
+                  <w:lang w:val="en-DE" w:eastAsia="en-DE"/>
+                  <w14:ligatures w14:val="none"/>
+                </w:rPr>
+                <m:t>e</m:t>
+              </m:r>
+            </m:e>
+            <m:sub>
+              <m:r>
+                <w:rPr>
+                  <w:rFonts w:ascii="Cambria Math" w:eastAsia="Times New Roman" w:hAnsi="Cambria Math" w:cs="Times New Roman"/>
+                  <w:kern w:val="0"/>
+                  <w:lang w:val="en-DE" w:eastAsia="en-DE"/>
+                  <w14:ligatures w14:val="none"/>
+                </w:rPr>
+                <m:t>i</m:t>
+              </m:r>
+            </m:sub>
+          </m:sSub>
+          <m:r>
+            <w:rPr>
+              <w:rFonts w:ascii="Cambria Math" w:eastAsia="Times New Roman" w:hAnsi="Cambria Math" w:cs="Times New Roman"/>
+              <w:kern w:val="0"/>
+              <w:lang w:val="en-DE" w:eastAsia="en-DE"/>
+              <w14:ligatures w14:val="none"/>
+            </w:rPr>
+            <m:t>- cos</m:t>
+          </m:r>
+          <m:sSub>
+            <m:sSubPr>
+              <m:ctrlPr>
+                <w:rPr>
+                  <w:rFonts w:ascii="Cambria Math" w:eastAsia="Times New Roman" w:hAnsi="Cambria Math" w:cs="Times New Roman"/>
+                  <w:i/>
+                  <w:kern w:val="0"/>
+                  <w:lang w:val="en-DE" w:eastAsia="en-DE"/>
+                  <w14:ligatures w14:val="none"/>
+                </w:rPr>
+              </m:ctrlPr>
+            </m:sSubPr>
+            <m:e>
+              <m:r>
+                <w:rPr>
+                  <w:rFonts w:ascii="Cambria Math" w:eastAsia="Times New Roman" w:hAnsi="Cambria Math" w:cs="Times New Roman"/>
+                  <w:kern w:val="0"/>
+                  <w:lang w:val="en-DE" w:eastAsia="en-DE"/>
+                  <w14:ligatures w14:val="none"/>
+                </w:rPr>
+                <m:t>t</m:t>
+              </m:r>
+            </m:e>
+            <m:sub>
+              <m:r>
+                <w:rPr>
+                  <w:rFonts w:ascii="Cambria Math" w:eastAsia="Times New Roman" w:hAnsi="Cambria Math" w:cs="Times New Roman"/>
+                  <w:kern w:val="0"/>
+                  <w:lang w:val="en-DE" w:eastAsia="en-DE"/>
+                  <w14:ligatures w14:val="none"/>
+                </w:rPr>
+                <m:t>i</m:t>
+              </m:r>
+            </m:sub>
+          </m:sSub>
+        </m:oMath>
+      </m:oMathPara>
+    </w:p>
+    <w:p>
+      <w:pPr>
+        <w:spacing w:before="100" w:beforeAutospacing="1" w:after="100" w:afterAutospacing="1" w:line="240" w:lineRule="auto"/>
+        <w:rPr>
+          <w:rFonts w:ascii="Times New Roman" w:eastAsia="Times New Roman" w:hAnsi="Times New Roman" w:cs="Times New Roman"/>
+          <w:kern w:val="0"/>
+          <w:lang w:val="en-DE" w:eastAsia="en-DE"/>
+          <w14:ligatures w14:val="none"/>
+        </w:rPr>
+      </w:pPr>
+      <w:r>
+        <w:rPr>
+          <w:rFonts w:ascii="Times New Roman" w:eastAsia="Times New Roman" w:hAnsi="Times New Roman" w:cs="Times New Roman"/>
+          <w:kern w:val="0"/>
+          <w:lang w:val="en-DE" w:eastAsia="en-DE"/>
+          <w14:ligatures w14:val="none"/>
+        </w:rPr>
+        <w:t>The scheduler selects the highest scoring feasible request subject to safety constraints derived from spatial conflict conditions.</w:t>
+      </w:r>
+      <w:r>
+        <w:rPr>
+          <w:rFonts w:ascii="Times New Roman" w:eastAsia="Times New Roman" w:hAnsi="Times New Roman" w:cs="Times New Roman"/>
+          <w:kern w:val="0"/>
+          <w:lang w:val="en-DE" w:eastAsia="en-DE"/>
+          <w14:ligatures w14:val="none"/>
+        </w:rPr>
+        <w:t xml:space="preserve"> </w:t>
+      </w:r>
+      <w:r>
+        <w:rPr>
+          <w:rFonts w:ascii="Times New Roman" w:eastAsia="Times New Roman" w:hAnsi="Times New Roman" w:cs="Times New Roman"/>
+          <w:kern w:val="0"/>
+          <w:lang w:val="en-DE" w:eastAsia="en-DE"/>
+          <w14:ligatures w14:val="none"/>
+        </w:rPr>
+        <w:t>This design is motivated by three primary engineering principles:</w:t>
+      </w:r>
+    </w:p>
+    <w:tbl>
+      <w:tblPr>
+        <w:tblStyle w:val="TableGrid"/>
+        <w:tblW w:w="0" w:type="auto"/>
+        <w:tblLook w:val="04A0" w:firstRow="1" w:lastRow="0" w:firstColumn="1" w:lastColumn="0" w:noHBand="0" w:noVBand="1"/>
+      </w:tblPr>
+      <w:tblGrid>
+        <w:gridCol w:w="1910"/>
+        <w:gridCol w:w="4045"/>
+        <w:gridCol w:w="3061"/>
+      </w:tblGrid>
+      <w:tr>
+        <w:tc>
+          <w:tcPr>
+            <w:tcW w:w="0" w:type="auto"/>
+            <w:vAlign w:val="center"/>
+            <w:hideMark/>
+          </w:tcPr>
+          <w:p>
+            <w:pPr>
+              <w:jc w:val="center"/>
+              <w:rPr>
+                <w:rFonts w:ascii="Times New Roman" w:eastAsia="Times New Roman" w:hAnsi="Times New Roman" w:cs="Times New Roman"/>
+                <w:b/>
+                <w:bCs/>
+                <w:kern w:val="0"/>
+                <w:lang w:val="en-DE" w:eastAsia="en-DE"/>
+                <w14:ligatures w14:val="none"/>
+              </w:rPr>
+            </w:pPr>
+            <w:r>
+              <w:rPr>
+                <w:rFonts w:ascii="Times New Roman" w:eastAsia="Times New Roman" w:hAnsi="Times New Roman" w:cs="Times New Roman"/>
+                <w:b/>
+                <w:bCs/>
+                <w:kern w:val="0"/>
+                <w:lang w:val="en-DE" w:eastAsia="en-DE"/>
+                <w14:ligatures w14:val="none"/>
+              </w:rPr>
+              <w:t>Design Aspect</w:t>
+            </w:r>
+          </w:p>
+        </w:tc>
+        <w:tc>
+          <w:tcPr>
+            <w:tcW w:w="0" w:type="auto"/>
+            <w:vAlign w:val="center"/>
+            <w:hideMark/>
+          </w:tcPr>
+          <w:p>
+            <w:pPr>
+              <w:jc w:val="center"/>
+              <w:rPr>
+                <w:rFonts w:ascii="Times New Roman" w:eastAsia="Times New Roman" w:hAnsi="Times New Roman" w:cs="Times New Roman"/>
+                <w:b/>
+                <w:bCs/>
+                <w:kern w:val="0"/>
+                <w:lang w:val="en-DE" w:eastAsia="en-DE"/>
+                <w14:ligatures w14:val="none"/>
+              </w:rPr>
+            </w:pPr>
+            <w:r>
+              <w:rPr>
+                <w:rFonts w:ascii="Times New Roman" w:eastAsia="Times New Roman" w:hAnsi="Times New Roman" w:cs="Times New Roman"/>
+                <w:b/>
+                <w:bCs/>
+                <w:kern w:val="0"/>
+                <w:lang w:val="en-DE" w:eastAsia="en-DE"/>
+                <w14:ligatures w14:val="none"/>
+              </w:rPr>
+              <w:t>Rationale</w:t>
+            </w:r>
+          </w:p>
+        </w:tc>
+        <w:tc>
+          <w:tcPr>
+            <w:tcW w:w="0" w:type="auto"/>
+            <w:vAlign w:val="center"/>
+            <w:hideMark/>
+          </w:tcPr>
+          <w:p>
+            <w:pPr>
+              <w:jc w:val="center"/>
+              <w:rPr>
+                <w:rFonts w:ascii="Times New Roman" w:eastAsia="Times New Roman" w:hAnsi="Times New Roman" w:cs="Times New Roman"/>
+                <w:b/>
+                <w:bCs/>
+                <w:kern w:val="0"/>
+                <w:lang w:val="en-DE" w:eastAsia="en-DE"/>
+                <w14:ligatures w14:val="none"/>
+              </w:rPr>
+            </w:pPr>
+            <w:r>
+              <w:rPr>
+                <w:rFonts w:ascii="Times New Roman" w:eastAsia="Times New Roman" w:hAnsi="Times New Roman" w:cs="Times New Roman"/>
+                <w:b/>
+                <w:bCs/>
+                <w:kern w:val="0"/>
+                <w:lang w:val="en-DE" w:eastAsia="en-DE"/>
+                <w14:ligatures w14:val="none"/>
+              </w:rPr>
+              <w:t>Effect / Guarantee</w:t>
+            </w:r>
+          </w:p>
+        </w:tc>
+      </w:tr>
+      <w:tr>
+        <w:tc>
+          <w:tcPr>
+            <w:tcW w:w="0" w:type="auto"/>
+            <w:vAlign w:val="center"/>
+            <w:hideMark/>
+          </w:tcPr>
+          <w:p>
+            <w:pPr>
+              <w:jc w:val="center"/>
+              <w:rPr>
+                <w:rFonts w:ascii="Times New Roman" w:eastAsia="Times New Roman" w:hAnsi="Times New Roman" w:cs="Times New Roman"/>
+                <w:kern w:val="0"/>
+                <w:lang w:val="en-DE" w:eastAsia="en-DE"/>
+                <w14:ligatures w14:val="none"/>
+              </w:rPr>
+            </w:pPr>
+            <w:r>
+              <w:rPr>
+                <w:rFonts w:ascii="Times New Roman" w:eastAsia="Times New Roman" w:hAnsi="Times New Roman" w:cs="Times New Roman"/>
+                <w:kern w:val="0"/>
+                <w:lang w:val="en-DE" w:eastAsia="en-DE"/>
+                <w14:ligatures w14:val="none"/>
+              </w:rPr>
+              <w:t>Real-Time Feasibility</w:t>
+            </w:r>
+          </w:p>
+        </w:tc>
+        <w:tc>
+          <w:tcPr>
+            <w:tcW w:w="0" w:type="auto"/>
+            <w:vAlign w:val="center"/>
+            <w:hideMark/>
+          </w:tcPr>
+          <w:p>
+            <w:pPr>
+              <w:jc w:val="center"/>
+              <w:rPr>
+                <w:rFonts w:ascii="Times New Roman" w:eastAsia="Times New Roman" w:hAnsi="Times New Roman" w:cs="Times New Roman"/>
+                <w:kern w:val="0"/>
+                <w:lang w:val="en-DE" w:eastAsia="en-DE"/>
+                <w14:ligatures w14:val="none"/>
+              </w:rPr>
+            </w:pPr>
+            <w:r>
+              <w:rPr>
+                <w:rFonts w:ascii="Times New Roman" w:eastAsia="Times New Roman" w:hAnsi="Times New Roman" w:cs="Times New Roman"/>
+                <w:kern w:val="0"/>
+                <w:lang w:val="en-DE" w:eastAsia="en-DE"/>
+                <w14:ligatures w14:val="none"/>
+              </w:rPr>
+              <w:t>Scheduling uses a greedy evaluation strategy to avoid exponential or combinatorial optimization. Decisions are computed with bounded complexity suitable for embedded execution.</w:t>
+            </w:r>
+          </w:p>
+        </w:tc>
+        <w:tc>
+          <w:tcPr>
+            <w:tcW w:w="0" w:type="auto"/>
+            <w:vAlign w:val="center"/>
+            <w:hideMark/>
+          </w:tcPr>
+          <w:p>
+            <w:pPr>
+              <w:jc w:val="center"/>
+              <w:rPr>
+                <w:rFonts w:ascii="Times New Roman" w:eastAsia="Times New Roman" w:hAnsi="Times New Roman" w:cs="Times New Roman"/>
+                <w:kern w:val="0"/>
+                <w:lang w:val="en-DE" w:eastAsia="en-DE"/>
+                <w14:ligatures w14:val="none"/>
+              </w:rPr>
+            </w:pPr>
+            <w:r>
+              <w:rPr>
+                <w:rFonts w:ascii="Times New Roman" w:eastAsia="Times New Roman" w:hAnsi="Times New Roman" w:cs="Times New Roman"/>
+                <w:kern w:val="0"/>
+                <w:lang w:val="en-DE" w:eastAsia="en-DE"/>
+                <w14:ligatures w14:val="none"/>
+              </w:rPr>
+              <w:t>Guarantees bounded computation time and compliance with strict real-time constraints (NFR-1, NFR-7, NFR-8).</w:t>
+            </w:r>
+          </w:p>
+        </w:tc>
+      </w:tr>
+      <w:tr>
+        <w:tc>
+          <w:tcPr>
+            <w:tcW w:w="0" w:type="auto"/>
+            <w:vAlign w:val="center"/>
+            <w:hideMark/>
+          </w:tcPr>
+          <w:p>
+            <w:pPr>
+              <w:jc w:val="center"/>
+              <w:rPr>
+                <w:rFonts w:ascii="Times New Roman" w:eastAsia="Times New Roman" w:hAnsi="Times New Roman" w:cs="Times New Roman"/>
+                <w:kern w:val="0"/>
+                <w:lang w:val="en-DE" w:eastAsia="en-DE"/>
+                <w14:ligatures w14:val="none"/>
+              </w:rPr>
+            </w:pPr>
+            <w:r>
+              <w:rPr>
+                <w:rFonts w:ascii="Times New Roman" w:eastAsia="Times New Roman" w:hAnsi="Times New Roman" w:cs="Times New Roman"/>
+                <w:kern w:val="0"/>
+                <w:lang w:val="en-DE" w:eastAsia="en-DE"/>
+                <w14:ligatures w14:val="none"/>
+              </w:rPr>
+              <w:t xml:space="preserve">Deterministic </w:t>
+            </w:r>
+            <w:proofErr w:type="spellStart"/>
+            <w:r>
+              <w:rPr>
+                <w:rFonts w:ascii="Times New Roman" w:eastAsia="Times New Roman" w:hAnsi="Times New Roman" w:cs="Times New Roman"/>
+                <w:kern w:val="0"/>
+                <w:lang w:val="en-DE" w:eastAsia="en-DE"/>
+                <w14:ligatures w14:val="none"/>
+              </w:rPr>
+              <w:t>Behavior</w:t>
+            </w:r>
+            <w:proofErr w:type="spellEnd"/>
+            <w:r>
+              <w:rPr>
+                <w:rFonts w:ascii="Times New Roman" w:eastAsia="Times New Roman" w:hAnsi="Times New Roman" w:cs="Times New Roman"/>
+                <w:kern w:val="0"/>
+                <w:lang w:val="en-DE" w:eastAsia="en-DE"/>
+                <w14:ligatures w14:val="none"/>
+              </w:rPr>
+              <w:t xml:space="preserve"> for Verification</w:t>
+            </w:r>
+          </w:p>
+        </w:tc>
+        <w:tc>
+          <w:tcPr>
+            <w:tcW w:w="0" w:type="auto"/>
+            <w:vAlign w:val="center"/>
+            <w:hideMark/>
+          </w:tcPr>
+          <w:p>
+            <w:pPr>
+              <w:jc w:val="center"/>
+              <w:rPr>
+                <w:rFonts w:ascii="Times New Roman" w:eastAsia="Times New Roman" w:hAnsi="Times New Roman" w:cs="Times New Roman"/>
+                <w:kern w:val="0"/>
+                <w:lang w:val="en-DE" w:eastAsia="en-DE"/>
+                <w14:ligatures w14:val="none"/>
+              </w:rPr>
+            </w:pPr>
+            <w:r>
+              <w:rPr>
+                <w:rFonts w:ascii="Times New Roman" w:eastAsia="Times New Roman" w:hAnsi="Times New Roman" w:cs="Times New Roman"/>
+                <w:kern w:val="0"/>
+                <w:lang w:val="en-DE" w:eastAsia="en-DE"/>
+                <w14:ligatures w14:val="none"/>
+              </w:rPr>
+              <w:t>The scheduling rule is fully deterministic given system state, including fixed tie-breaking. This supports reproducible execution traces in timed automata models.</w:t>
+            </w:r>
+          </w:p>
+        </w:tc>
+        <w:tc>
+          <w:tcPr>
+            <w:tcW w:w="0" w:type="auto"/>
+            <w:vAlign w:val="center"/>
+            <w:hideMark/>
+          </w:tcPr>
+          <w:p>
+            <w:pPr>
+              <w:jc w:val="center"/>
+              <w:rPr>
+                <w:rFonts w:ascii="Times New Roman" w:eastAsia="Times New Roman" w:hAnsi="Times New Roman" w:cs="Times New Roman"/>
+                <w:kern w:val="0"/>
+                <w:lang w:val="en-DE" w:eastAsia="en-DE"/>
+                <w14:ligatures w14:val="none"/>
+              </w:rPr>
+            </w:pPr>
+            <w:r>
+              <w:rPr>
+                <w:rFonts w:ascii="Times New Roman" w:eastAsia="Times New Roman" w:hAnsi="Times New Roman" w:cs="Times New Roman"/>
+                <w:kern w:val="0"/>
+                <w:lang w:val="en-DE" w:eastAsia="en-DE"/>
+                <w14:ligatures w14:val="none"/>
+              </w:rPr>
+              <w:t>Ensures identical outputs for identical inputs, enabling formal verification and tractable state-space exploration (NFR-2).</w:t>
+            </w:r>
+          </w:p>
+        </w:tc>
+      </w:tr>
+      <w:tr>
+        <w:tc>
+          <w:tcPr>
+            <w:tcW w:w="0" w:type="auto"/>
+            <w:vAlign w:val="center"/>
+            <w:hideMark/>
+          </w:tcPr>
+          <w:p>
+            <w:pPr>
+              <w:jc w:val="center"/>
+              <w:rPr>
+                <w:rFonts w:ascii="Times New Roman" w:eastAsia="Times New Roman" w:hAnsi="Times New Roman" w:cs="Times New Roman"/>
+                <w:kern w:val="0"/>
+                <w:lang w:val="en-DE" w:eastAsia="en-DE"/>
+                <w14:ligatures w14:val="none"/>
+              </w:rPr>
+            </w:pPr>
+            <w:r>
+              <w:rPr>
+                <w:rFonts w:ascii="Times New Roman" w:eastAsia="Times New Roman" w:hAnsi="Times New Roman" w:cs="Times New Roman"/>
+                <w:kern w:val="0"/>
+                <w:lang w:val="en-DE" w:eastAsia="en-DE"/>
+                <w14:ligatures w14:val="none"/>
+              </w:rPr>
+              <w:t>Incremental Fairness via Aging</w:t>
+            </w:r>
+          </w:p>
+        </w:tc>
+        <w:tc>
+          <w:tcPr>
+            <w:tcW w:w="0" w:type="auto"/>
+            <w:vAlign w:val="center"/>
+            <w:hideMark/>
+          </w:tcPr>
+          <w:p>
+            <w:pPr>
+              <w:jc w:val="center"/>
+              <w:rPr>
+                <w:rFonts w:ascii="Times New Roman" w:eastAsia="Times New Roman" w:hAnsi="Times New Roman" w:cs="Times New Roman"/>
+                <w:kern w:val="0"/>
+                <w:lang w:val="en-DE" w:eastAsia="en-DE"/>
+                <w14:ligatures w14:val="none"/>
+              </w:rPr>
+            </w:pPr>
+            <w:r>
+              <w:rPr>
+                <w:rFonts w:ascii="Times New Roman" w:eastAsia="Times New Roman" w:hAnsi="Times New Roman" w:cs="Times New Roman"/>
+                <w:kern w:val="0"/>
+                <w:lang w:val="en-DE" w:eastAsia="en-DE"/>
+                <w14:ligatures w14:val="none"/>
+              </w:rPr>
+              <w:t>A monotonic aging mechanism increases priority of waiting requests over time, counteracting starvation in pure priority schemes.</w:t>
+            </w:r>
+          </w:p>
+        </w:tc>
+        <w:tc>
+          <w:tcPr>
+            <w:tcW w:w="0" w:type="auto"/>
+            <w:vAlign w:val="center"/>
+            <w:hideMark/>
+          </w:tcPr>
+          <w:p>
+            <w:pPr>
+              <w:jc w:val="center"/>
+              <w:rPr>
+                <w:rFonts w:ascii="Times New Roman" w:eastAsia="Times New Roman" w:hAnsi="Times New Roman" w:cs="Times New Roman"/>
+                <w:kern w:val="0"/>
+                <w:lang w:val="en-DE" w:eastAsia="en-DE"/>
+                <w14:ligatures w14:val="none"/>
+              </w:rPr>
+            </w:pPr>
+            <w:r>
+              <w:rPr>
+                <w:rFonts w:ascii="Times New Roman" w:eastAsia="Times New Roman" w:hAnsi="Times New Roman" w:cs="Times New Roman"/>
+                <w:kern w:val="0"/>
+                <w:lang w:val="en-DE" w:eastAsia="en-DE"/>
+                <w14:ligatures w14:val="none"/>
+              </w:rPr>
+              <w:t>Provides weak fairness: all continuously pending requests are eventually served under stable conditions (NFR-18).</w:t>
+            </w:r>
+          </w:p>
+        </w:tc>
+      </w:tr>
+    </w:tbl>
+    <w:p>
+      <w:pPr>
+        <w:spacing w:after="0" w:line="240" w:lineRule="auto"/>
+        <w:rPr>
+          <w:rFonts w:ascii="Times New Roman" w:eastAsia="Times New Roman" w:hAnsi="Times New Roman" w:cs="Times New Roman"/>
+          <w:kern w:val="0"/>
+          <w:lang w:val="en-DE" w:eastAsia="en-DE"/>
+          <w14:ligatures w14:val="none"/>
+        </w:rPr>
+      </w:pPr>
+    </w:p>
+    <w:p>
+      <w:pPr>
+        <w:spacing w:before="100" w:beforeAutospacing="1" w:after="100" w:afterAutospacing="1" w:line="240" w:lineRule="auto"/>
+        <w:outlineLvl w:val="2"/>
+        <w:rPr>
+          <w:rFonts w:ascii="Times New Roman" w:eastAsia="Times New Roman" w:hAnsi="Times New Roman" w:cs="Times New Roman"/>
+          <w:b/>
+          <w:bCs/>
+          <w:kern w:val="0"/>
+          <w:sz w:val="27"/>
+          <w:szCs w:val="27"/>
+          <w:lang w:val="en-DE" w:eastAsia="en-DE"/>
+          <w14:ligatures w14:val="none"/>
+        </w:rPr>
+      </w:pPr>
+      <w:r>
+        <w:rPr>
+          <w:rFonts w:ascii="Times New Roman" w:eastAsia="Times New Roman" w:hAnsi="Times New Roman" w:cs="Times New Roman"/>
+          <w:b/>
+          <w:bCs/>
+          <w:kern w:val="0"/>
+          <w:sz w:val="27"/>
+          <w:szCs w:val="27"/>
+          <w:lang w:val="en-DE" w:eastAsia="en-DE"/>
+          <w14:ligatures w14:val="none"/>
+        </w:rPr>
+        <w:t>3. Safety Model and Separation of Concerns</w:t>
+      </w:r>
+    </w:p>
+    <w:p>
+      <w:pPr>
+        <w:spacing w:before="100" w:beforeAutospacing="1" w:after="100" w:afterAutospacing="1" w:line="240" w:lineRule="auto"/>
+        <w:jc w:val="both"/>
+        <w:rPr>
+          <w:rFonts w:ascii="Times New Roman" w:eastAsia="Times New Roman" w:hAnsi="Times New Roman" w:cs="Times New Roman"/>
+          <w:kern w:val="0"/>
+          <w:lang w:val="en-DE" w:eastAsia="en-DE"/>
+          <w14:ligatures w14:val="none"/>
+        </w:rPr>
+      </w:pPr>
+      <w:r>
+        <w:rPr>
+          <w:rFonts w:ascii="Times New Roman" w:eastAsia="Times New Roman" w:hAnsi="Times New Roman" w:cs="Times New Roman"/>
+          <w:kern w:val="0"/>
+          <w:lang w:val="en-DE" w:eastAsia="en-DE"/>
+          <w14:ligatures w14:val="none"/>
+        </w:rPr>
+        <w:t xml:space="preserve">Safety is enforced not through the scoring function, but through an explicit </w:t>
+      </w:r>
+      <w:r>
+        <w:rPr>
+          <w:rFonts w:ascii="Times New Roman" w:eastAsia="Times New Roman" w:hAnsi="Times New Roman" w:cs="Times New Roman"/>
+          <w:b/>
+          <w:bCs/>
+          <w:kern w:val="0"/>
+          <w:lang w:val="en-DE" w:eastAsia="en-DE"/>
+          <w14:ligatures w14:val="none"/>
+        </w:rPr>
+        <w:t>conflict-aware execution layer</w:t>
+      </w:r>
+      <w:r>
+        <w:rPr>
+          <w:rFonts w:ascii="Times New Roman" w:eastAsia="Times New Roman" w:hAnsi="Times New Roman" w:cs="Times New Roman"/>
+          <w:kern w:val="0"/>
+          <w:lang w:val="en-DE" w:eastAsia="en-DE"/>
+          <w14:ligatures w14:val="none"/>
+        </w:rPr>
+        <w:t xml:space="preserve"> (intersection controller). Spatial constraints are </w:t>
+      </w:r>
+      <w:proofErr w:type="spellStart"/>
+      <w:r>
+        <w:rPr>
+          <w:rFonts w:ascii="Times New Roman" w:eastAsia="Times New Roman" w:hAnsi="Times New Roman" w:cs="Times New Roman"/>
+          <w:kern w:val="0"/>
+          <w:lang w:val="en-DE" w:eastAsia="en-DE"/>
+          <w14:ligatures w14:val="none"/>
+        </w:rPr>
+        <w:t>modeled</w:t>
+      </w:r>
+      <w:proofErr w:type="spellEnd"/>
+      <w:r>
+        <w:rPr>
+          <w:rFonts w:ascii="Times New Roman" w:eastAsia="Times New Roman" w:hAnsi="Times New Roman" w:cs="Times New Roman"/>
+          <w:kern w:val="0"/>
+          <w:lang w:val="en-DE" w:eastAsia="en-DE"/>
+          <w14:ligatures w14:val="none"/>
+        </w:rPr>
+        <w:t xml:space="preserve"> as mutually exclusive resource regions (quadrants or conflict zones), and vehicle execution is permitted only if no overlap exists with already reserved regions.</w:t>
+      </w:r>
+    </w:p>
+    <w:p>
+      <w:pPr>
+        <w:spacing w:before="100" w:beforeAutospacing="1" w:after="100" w:afterAutospacing="1" w:line="240" w:lineRule="auto"/>
+        <w:rPr>
+          <w:rFonts w:ascii="Times New Roman" w:eastAsia="Times New Roman" w:hAnsi="Times New Roman" w:cs="Times New Roman"/>
+          <w:kern w:val="0"/>
+          <w:lang w:val="en-DE" w:eastAsia="en-DE"/>
+          <w14:ligatures w14:val="none"/>
+        </w:rPr>
+      </w:pPr>
+      <w:r>
+        <w:rPr>
+          <w:rFonts w:ascii="Times New Roman" w:eastAsia="Times New Roman" w:hAnsi="Times New Roman" w:cs="Times New Roman"/>
+          <w:kern w:val="0"/>
+          <w:lang w:val="en-DE" w:eastAsia="en-DE"/>
+          <w14:ligatures w14:val="none"/>
+        </w:rPr>
+        <w:t>This design follows a strict separation:</w:t>
+      </w:r>
+    </w:p>
+    <w:p>
+      <w:pPr>
+        <w:numPr>
+          <w:ilvl w:val="0"/>
+          <w:numId w:val="8"/>
+        </w:numPr>
+        <w:spacing w:before="100" w:beforeAutospacing="1" w:after="100" w:afterAutospacing="1" w:line="240" w:lineRule="auto"/>
+        <w:rPr>
+          <w:rFonts w:ascii="Times New Roman" w:eastAsia="Times New Roman" w:hAnsi="Times New Roman" w:cs="Times New Roman"/>
+          <w:kern w:val="0"/>
+          <w:lang w:val="en-DE" w:eastAsia="en-DE"/>
+          <w14:ligatures w14:val="none"/>
+        </w:rPr>
+      </w:pPr>
+      <w:r>
+        <w:rPr>
+          <w:rFonts w:ascii="Times New Roman" w:eastAsia="Times New Roman" w:hAnsi="Times New Roman" w:cs="Times New Roman"/>
+          <w:b/>
+          <w:bCs/>
+          <w:kern w:val="0"/>
+          <w:lang w:val="en-DE" w:eastAsia="en-DE"/>
+          <w14:ligatures w14:val="none"/>
+        </w:rPr>
+        <w:t>Scheduler layer:</w:t>
+      </w:r>
+      <w:r>
+        <w:rPr>
+          <w:rFonts w:ascii="Times New Roman" w:eastAsia="Times New Roman" w:hAnsi="Times New Roman" w:cs="Times New Roman"/>
+          <w:kern w:val="0"/>
+          <w:lang w:val="en-DE" w:eastAsia="en-DE"/>
+          <w14:ligatures w14:val="none"/>
+        </w:rPr>
+        <w:t xml:space="preserve"> decides ordering and selection </w:t>
+      </w:r>
+    </w:p>
+    <w:p>
+      <w:pPr>
+        <w:numPr>
+          <w:ilvl w:val="0"/>
+          <w:numId w:val="8"/>
+        </w:numPr>
+        <w:spacing w:before="100" w:beforeAutospacing="1" w:after="100" w:afterAutospacing="1" w:line="240" w:lineRule="auto"/>
+        <w:rPr>
+          <w:rFonts w:ascii="Times New Roman" w:eastAsia="Times New Roman" w:hAnsi="Times New Roman" w:cs="Times New Roman"/>
+          <w:kern w:val="0"/>
+          <w:lang w:val="en-DE" w:eastAsia="en-DE"/>
+          <w14:ligatures w14:val="none"/>
+        </w:rPr>
+      </w:pPr>
+      <w:r>
+        <w:rPr>
+          <w:rFonts w:ascii="Times New Roman" w:eastAsia="Times New Roman" w:hAnsi="Times New Roman" w:cs="Times New Roman"/>
+          <w:b/>
+          <w:bCs/>
+          <w:kern w:val="0"/>
+          <w:lang w:val="en-DE" w:eastAsia="en-DE"/>
+          <w14:ligatures w14:val="none"/>
+        </w:rPr>
+        <w:t>Controller layer:</w:t>
+      </w:r>
+      <w:r>
+        <w:rPr>
+          <w:rFonts w:ascii="Times New Roman" w:eastAsia="Times New Roman" w:hAnsi="Times New Roman" w:cs="Times New Roman"/>
+          <w:kern w:val="0"/>
+          <w:lang w:val="en-DE" w:eastAsia="en-DE"/>
+          <w14:ligatures w14:val="none"/>
+        </w:rPr>
+        <w:t xml:space="preserve"> enforces safety constraints and resource exclusivity </w:t>
+      </w:r>
+    </w:p>
+    <w:p>
+      <w:pPr>
+        <w:spacing w:before="100" w:beforeAutospacing="1" w:after="100" w:afterAutospacing="1" w:line="240" w:lineRule="auto"/>
+        <w:jc w:val="both"/>
+        <w:rPr>
+          <w:rFonts w:ascii="Times New Roman" w:eastAsia="Times New Roman" w:hAnsi="Times New Roman" w:cs="Times New Roman"/>
+          <w:kern w:val="0"/>
+          <w:lang w:val="en-DE" w:eastAsia="en-DE"/>
+          <w14:ligatures w14:val="none"/>
+        </w:rPr>
+      </w:pPr>
+      <w:r>
+        <w:rPr>
+          <w:rFonts w:ascii="Times New Roman" w:eastAsia="Times New Roman" w:hAnsi="Times New Roman" w:cs="Times New Roman"/>
+          <w:kern w:val="0"/>
+          <w:lang w:val="en-DE" w:eastAsia="en-DE"/>
+          <w14:ligatures w14:val="none"/>
+        </w:rPr>
+        <w:t>This separation ensures that even in the presence of suboptimal or heuristic scheduling decisions, safety invariants remain structurally enforced.</w:t>
+      </w:r>
+    </w:p>
+    <w:p>
+      <w:pPr>
+        <w:spacing w:before="100" w:beforeAutospacing="1" w:after="100" w:afterAutospacing="1" w:line="240" w:lineRule="auto"/>
+        <w:jc w:val="both"/>
+        <w:rPr>
+          <w:rFonts w:ascii="Times New Roman" w:eastAsia="Times New Roman" w:hAnsi="Times New Roman" w:cs="Times New Roman"/>
+          <w:kern w:val="0"/>
+          <w:lang w:val="en-DE" w:eastAsia="en-DE"/>
+          <w14:ligatures w14:val="none"/>
+        </w:rPr>
+      </w:pPr>
+    </w:p>
+    <w:p>
+      <w:pPr>
+        <w:spacing w:before="100" w:beforeAutospacing="1" w:after="100" w:afterAutospacing="1" w:line="240" w:lineRule="auto"/>
+        <w:jc w:val="both"/>
+        <w:rPr>
+          <w:rFonts w:ascii="Times New Roman" w:eastAsia="Times New Roman" w:hAnsi="Times New Roman" w:cs="Times New Roman"/>
+          <w:kern w:val="0"/>
+          <w:lang w:val="en-DE" w:eastAsia="en-DE"/>
+          <w14:ligatures w14:val="none"/>
+        </w:rPr>
+      </w:pPr>
+    </w:p>
+    <w:p>
+      <w:pPr>
+        <w:spacing w:before="100" w:beforeAutospacing="1" w:after="100" w:afterAutospacing="1" w:line="240" w:lineRule="auto"/>
+        <w:outlineLvl w:val="2"/>
+        <w:rPr>
+          <w:rFonts w:ascii="Times New Roman" w:eastAsia="Times New Roman" w:hAnsi="Times New Roman" w:cs="Times New Roman"/>
+          <w:b/>
+          <w:bCs/>
+          <w:kern w:val="0"/>
+          <w:sz w:val="27"/>
+          <w:szCs w:val="27"/>
+          <w:lang w:val="en-DE" w:eastAsia="en-DE"/>
+          <w14:ligatures w14:val="none"/>
+        </w:rPr>
+      </w:pPr>
+      <w:r>
+        <w:rPr>
+          <w:rFonts w:ascii="Times New Roman" w:eastAsia="Times New Roman" w:hAnsi="Times New Roman" w:cs="Times New Roman"/>
+          <w:b/>
+          <w:bCs/>
+          <w:kern w:val="0"/>
+          <w:sz w:val="27"/>
+          <w:szCs w:val="27"/>
+          <w:lang w:val="en-DE" w:eastAsia="en-DE"/>
+          <w14:ligatures w14:val="none"/>
+        </w:rPr>
+        <w:lastRenderedPageBreak/>
+        <w:t>4. Theoretical Properties and Guarantees</w:t>
+      </w:r>
+    </w:p>
+    <w:p>
+      <w:pPr>
+        <w:spacing w:before="100" w:beforeAutospacing="1" w:after="100" w:afterAutospacing="1" w:line="240" w:lineRule="auto"/>
+        <w:rPr>
+          <w:rFonts w:ascii="Times New Roman" w:eastAsia="Times New Roman" w:hAnsi="Times New Roman" w:cs="Times New Roman"/>
+          <w:kern w:val="0"/>
+          <w:lang w:val="en-DE" w:eastAsia="en-DE"/>
+          <w14:ligatures w14:val="none"/>
+        </w:rPr>
+      </w:pPr>
+      <w:r>
+        <w:rPr>
+          <w:rFonts w:ascii="Times New Roman" w:eastAsia="Times New Roman" w:hAnsi="Times New Roman" w:cs="Times New Roman"/>
+          <w:kern w:val="0"/>
+          <w:lang w:val="en-DE" w:eastAsia="en-DE"/>
+          <w14:ligatures w14:val="none"/>
+        </w:rPr>
+        <w:t>The proposed approach guarantees the following system-level properties under correct implementation:</w:t>
+      </w:r>
+    </w:p>
+    <w:tbl>
+      <w:tblPr>
+        <w:tblStyle w:val="TableGrid1"/>
+        <w:tblW w:w="0" w:type="auto"/>
+        <w:tblLook w:val="04A0" w:firstRow="1" w:lastRow="0" w:firstColumn="1" w:lastColumn="0" w:noHBand="0" w:noVBand="1"/>
+      </w:tblPr>
+      <w:tblGrid>
+        <w:gridCol w:w="1691"/>
+        <w:gridCol w:w="3861"/>
+        <w:gridCol w:w="3464"/>
+      </w:tblGrid>
+      <w:tr>
+        <w:tc>
+          <w:tcPr>
+            <w:tcW w:w="0" w:type="auto"/>
+            <w:hideMark/>
+          </w:tcPr>
+          <w:p>
+            <w:pPr>
+              <w:jc w:val="center"/>
+              <w:rPr>
+                <w:rFonts w:ascii="Times New Roman" w:eastAsia="Times New Roman" w:hAnsi="Times New Roman" w:cs="Times New Roman"/>
+                <w:b/>
+                <w:bCs/>
+                <w:lang w:val="en-DE" w:eastAsia="en-DE"/>
+              </w:rPr>
+            </w:pPr>
+            <w:r>
+              <w:rPr>
+                <w:rFonts w:ascii="Times New Roman" w:eastAsia="Times New Roman" w:hAnsi="Times New Roman" w:cs="Times New Roman"/>
+                <w:b/>
+                <w:bCs/>
+                <w:lang w:val="en-DE" w:eastAsia="en-DE"/>
+              </w:rPr>
+              <w:t>Property</w:t>
+            </w:r>
+          </w:p>
+        </w:tc>
+        <w:tc>
+          <w:tcPr>
+            <w:tcW w:w="0" w:type="auto"/>
+            <w:hideMark/>
+          </w:tcPr>
+          <w:p>
+            <w:pPr>
+              <w:jc w:val="center"/>
+              <w:rPr>
+                <w:rFonts w:ascii="Times New Roman" w:eastAsia="Times New Roman" w:hAnsi="Times New Roman" w:cs="Times New Roman"/>
+                <w:b/>
+                <w:bCs/>
+                <w:lang w:val="en-DE" w:eastAsia="en-DE"/>
+              </w:rPr>
+            </w:pPr>
+            <w:r>
+              <w:rPr>
+                <w:rFonts w:ascii="Times New Roman" w:eastAsia="Times New Roman" w:hAnsi="Times New Roman" w:cs="Times New Roman"/>
+                <w:b/>
+                <w:bCs/>
+                <w:lang w:val="en-DE" w:eastAsia="en-DE"/>
+              </w:rPr>
+              <w:t>Formal Statement</w:t>
+            </w:r>
+          </w:p>
+        </w:tc>
+        <w:tc>
+          <w:tcPr>
+            <w:tcW w:w="0" w:type="auto"/>
+            <w:hideMark/>
+          </w:tcPr>
+          <w:p>
+            <w:pPr>
+              <w:jc w:val="center"/>
+              <w:rPr>
+                <w:rFonts w:ascii="Times New Roman" w:eastAsia="Times New Roman" w:hAnsi="Times New Roman" w:cs="Times New Roman"/>
+                <w:b/>
+                <w:bCs/>
+                <w:lang w:val="en-DE" w:eastAsia="en-DE"/>
+              </w:rPr>
+            </w:pPr>
+            <w:r>
+              <w:rPr>
+                <w:rFonts w:ascii="Times New Roman" w:eastAsia="Times New Roman" w:hAnsi="Times New Roman" w:cs="Times New Roman"/>
+                <w:b/>
+                <w:bCs/>
+                <w:lang w:val="en-DE" w:eastAsia="en-DE"/>
+              </w:rPr>
+              <w:t>Guarantee / Interpretation</w:t>
+            </w:r>
+          </w:p>
+        </w:tc>
+      </w:tr>
+      <w:tr>
+        <w:tc>
+          <w:tcPr>
+            <w:tcW w:w="0" w:type="auto"/>
+            <w:vAlign w:val="center"/>
+            <w:hideMark/>
+          </w:tcPr>
+          <w:p>
+            <w:pPr>
+              <w:rPr>
+                <w:rFonts w:ascii="Times New Roman" w:eastAsia="Times New Roman" w:hAnsi="Times New Roman" w:cs="Times New Roman"/>
+                <w:lang w:val="en-DE" w:eastAsia="en-DE"/>
+              </w:rPr>
+            </w:pPr>
+            <w:r>
+              <w:rPr>
+                <w:rFonts w:ascii="Times New Roman" w:eastAsia="Times New Roman" w:hAnsi="Times New Roman" w:cs="Times New Roman"/>
+                <w:lang w:val="en-DE" w:eastAsia="en-DE"/>
+              </w:rPr>
+              <w:t>Conflict Safety (Hard Guarantee)</w:t>
+            </w:r>
+          </w:p>
+        </w:tc>
+        <w:tc>
+          <w:tcPr>
+            <w:tcW w:w="0" w:type="auto"/>
+            <w:vAlign w:val="center"/>
+            <w:hideMark/>
+          </w:tcPr>
+          <w:p>
+            <w:pPr>
+              <w:rPr>
+                <w:rFonts w:ascii="Times New Roman" w:eastAsia="Times New Roman" w:hAnsi="Times New Roman" w:cs="Times New Roman"/>
+                <w:lang w:val="en-DE" w:eastAsia="en-DE"/>
+              </w:rPr>
+            </w:pPr>
+            <w:r>
+              <w:rPr>
+                <w:rFonts w:ascii="Times New Roman" w:eastAsia="Times New Roman" w:hAnsi="Times New Roman" w:cs="Times New Roman"/>
+                <w:lang w:val="en-DE" w:eastAsia="en-DE"/>
+              </w:rPr>
+              <w:t>No two concurrently executing vehicles are assigned overlapping spatial conflict zones. This corresponds to an invariant over a conflict graph ensuring independent set selection at execution time.</w:t>
+            </w:r>
+          </w:p>
+        </w:tc>
+        <w:tc>
+          <w:tcPr>
+            <w:tcW w:w="0" w:type="auto"/>
+            <w:vAlign w:val="center"/>
+            <w:hideMark/>
+          </w:tcPr>
+          <w:p>
+            <w:pPr>
+              <w:rPr>
+                <w:rFonts w:ascii="Times New Roman" w:eastAsia="Times New Roman" w:hAnsi="Times New Roman" w:cs="Times New Roman"/>
+                <w:lang w:val="en-DE" w:eastAsia="en-DE"/>
+              </w:rPr>
+            </w:pPr>
+            <w:r>
+              <w:rPr>
+                <w:rFonts w:ascii="Times New Roman" w:eastAsia="Times New Roman" w:hAnsi="Times New Roman" w:cs="Times New Roman"/>
+                <w:lang w:val="en-DE" w:eastAsia="en-DE"/>
+              </w:rPr>
+              <w:t>Ensures strict mutual exclusion in shared intersection regions. Safety is enforced as an invariant, preventing simultaneous occupation of conflicting zones.</w:t>
+            </w:r>
+          </w:p>
+        </w:tc>
+      </w:tr>
+      <w:tr>
+        <w:tc>
+          <w:tcPr>
+            <w:tcW w:w="0" w:type="auto"/>
+            <w:vAlign w:val="center"/>
+            <w:hideMark/>
+          </w:tcPr>
+          <w:p>
+            <w:pPr>
+              <w:rPr>
+                <w:rFonts w:ascii="Times New Roman" w:eastAsia="Times New Roman" w:hAnsi="Times New Roman" w:cs="Times New Roman"/>
+                <w:lang w:val="en-DE" w:eastAsia="en-DE"/>
+              </w:rPr>
+            </w:pPr>
+            <w:r>
+              <w:rPr>
+                <w:rFonts w:ascii="Times New Roman" w:eastAsia="Times New Roman" w:hAnsi="Times New Roman" w:cs="Times New Roman"/>
+                <w:lang w:val="en-DE" w:eastAsia="en-DE"/>
+              </w:rPr>
+              <w:t>Determinism</w:t>
+            </w:r>
+          </w:p>
+        </w:tc>
+        <w:tc>
+          <w:tcPr>
+            <w:tcW w:w="0" w:type="auto"/>
+            <w:vAlign w:val="center"/>
+            <w:hideMark/>
+          </w:tcPr>
+          <w:p>
+            <w:pPr>
+              <w:rPr>
+                <w:rFonts w:ascii="Times New Roman" w:eastAsia="Times New Roman" w:hAnsi="Times New Roman" w:cs="Times New Roman"/>
+                <w:lang w:val="en-DE" w:eastAsia="en-DE"/>
+              </w:rPr>
+            </w:pPr>
+            <w:r>
+              <w:rPr>
+                <w:rFonts w:ascii="Times New Roman" w:eastAsia="Times New Roman" w:hAnsi="Times New Roman" w:cs="Times New Roman"/>
+                <w:lang w:val="en-DE" w:eastAsia="en-DE"/>
+              </w:rPr>
+              <w:t>Given identical system states, the scheduler produces identical outputs. Determinism is achieved through a fixed scoring function and deterministic tie-breaking.</w:t>
+            </w:r>
+          </w:p>
+        </w:tc>
+        <w:tc>
+          <w:tcPr>
+            <w:tcW w:w="0" w:type="auto"/>
+            <w:vAlign w:val="center"/>
+            <w:hideMark/>
+          </w:tcPr>
+          <w:p>
+            <w:pPr>
+              <w:rPr>
+                <w:rFonts w:ascii="Times New Roman" w:eastAsia="Times New Roman" w:hAnsi="Times New Roman" w:cs="Times New Roman"/>
+                <w:lang w:val="en-DE" w:eastAsia="en-DE"/>
+              </w:rPr>
+            </w:pPr>
+            <w:r>
+              <w:rPr>
+                <w:rFonts w:ascii="Times New Roman" w:eastAsia="Times New Roman" w:hAnsi="Times New Roman" w:cs="Times New Roman"/>
+                <w:lang w:val="en-DE" w:eastAsia="en-DE"/>
+              </w:rPr>
+              <w:t xml:space="preserve">Guarantees reproducibility of scheduling decisions, enabling formal verification and consistent system </w:t>
+            </w:r>
+            <w:proofErr w:type="spellStart"/>
+            <w:r>
+              <w:rPr>
+                <w:rFonts w:ascii="Times New Roman" w:eastAsia="Times New Roman" w:hAnsi="Times New Roman" w:cs="Times New Roman"/>
+                <w:lang w:val="en-DE" w:eastAsia="en-DE"/>
+              </w:rPr>
+              <w:t>behavior</w:t>
+            </w:r>
+            <w:proofErr w:type="spellEnd"/>
+            <w:r>
+              <w:rPr>
+                <w:rFonts w:ascii="Times New Roman" w:eastAsia="Times New Roman" w:hAnsi="Times New Roman" w:cs="Times New Roman"/>
+                <w:lang w:val="en-DE" w:eastAsia="en-DE"/>
+              </w:rPr>
+              <w:t xml:space="preserve"> across executions.</w:t>
+            </w:r>
+          </w:p>
+        </w:tc>
+      </w:tr>
+      <w:tr>
+        <w:tc>
+          <w:tcPr>
+            <w:tcW w:w="0" w:type="auto"/>
+            <w:vAlign w:val="center"/>
+            <w:hideMark/>
+          </w:tcPr>
+          <w:p>
+            <w:pPr>
+              <w:rPr>
+                <w:rFonts w:ascii="Times New Roman" w:eastAsia="Times New Roman" w:hAnsi="Times New Roman" w:cs="Times New Roman"/>
+                <w:lang w:val="en-DE" w:eastAsia="en-DE"/>
+              </w:rPr>
+            </w:pPr>
+            <w:r>
+              <w:rPr>
+                <w:rFonts w:ascii="Times New Roman" w:eastAsia="Times New Roman" w:hAnsi="Times New Roman" w:cs="Times New Roman"/>
+                <w:lang w:val="en-DE" w:eastAsia="en-DE"/>
+              </w:rPr>
+              <w:t>Bounded Execution Time</w:t>
+            </w:r>
+          </w:p>
+        </w:tc>
+        <w:tc>
+          <w:tcPr>
+            <w:tcW w:w="0" w:type="auto"/>
+            <w:vAlign w:val="center"/>
+            <w:hideMark/>
+          </w:tcPr>
+          <w:p>
+            <w:pPr>
+              <w:rPr>
+                <w:rFonts w:ascii="Times New Roman" w:eastAsia="Times New Roman" w:hAnsi="Times New Roman" w:cs="Times New Roman"/>
+                <w:lang w:val="en-DE" w:eastAsia="en-DE"/>
+              </w:rPr>
+            </w:pPr>
+            <w:r>
+              <w:rPr>
+                <w:rFonts w:ascii="Times New Roman" w:eastAsia="Times New Roman" w:hAnsi="Times New Roman" w:cs="Times New Roman"/>
+                <w:lang w:val="en-DE" w:eastAsia="en-DE"/>
+              </w:rPr>
+              <w:t>Scheduling decisions are computed in polynomial time with respect to the number of active vehicles, ensuring compliance with strict real-time constraints.</w:t>
+            </w:r>
+          </w:p>
+        </w:tc>
+        <w:tc>
+          <w:tcPr>
+            <w:tcW w:w="0" w:type="auto"/>
+            <w:vAlign w:val="center"/>
+            <w:hideMark/>
+          </w:tcPr>
+          <w:p>
+            <w:pPr>
+              <w:rPr>
+                <w:rFonts w:ascii="Times New Roman" w:eastAsia="Times New Roman" w:hAnsi="Times New Roman" w:cs="Times New Roman"/>
+                <w:lang w:val="en-DE" w:eastAsia="en-DE"/>
+              </w:rPr>
+            </w:pPr>
+            <w:r>
+              <w:rPr>
+                <w:rFonts w:ascii="Times New Roman" w:eastAsia="Times New Roman" w:hAnsi="Times New Roman" w:cs="Times New Roman"/>
+                <w:lang w:val="en-DE" w:eastAsia="en-DE"/>
+              </w:rPr>
+              <w:t>Ensures predictable worst-case computation time and satisfies real-time system requirements.</w:t>
+            </w:r>
+          </w:p>
+        </w:tc>
+      </w:tr>
+      <w:tr>
+        <w:tc>
+          <w:tcPr>
+            <w:tcW w:w="0" w:type="auto"/>
+            <w:vAlign w:val="center"/>
+            <w:hideMark/>
+          </w:tcPr>
+          <w:p>
+            <w:pPr>
+              <w:rPr>
+                <w:rFonts w:ascii="Times New Roman" w:eastAsia="Times New Roman" w:hAnsi="Times New Roman" w:cs="Times New Roman"/>
+                <w:lang w:val="en-DE" w:eastAsia="en-DE"/>
+              </w:rPr>
+            </w:pPr>
+            <w:r>
+              <w:rPr>
+                <w:rFonts w:ascii="Times New Roman" w:eastAsia="Times New Roman" w:hAnsi="Times New Roman" w:cs="Times New Roman"/>
+                <w:lang w:val="en-DE" w:eastAsia="en-DE"/>
+              </w:rPr>
+              <w:t>Starvation Freedom (Weak Fairness)</w:t>
+            </w:r>
+          </w:p>
+        </w:tc>
+        <w:tc>
+          <w:tcPr>
+            <w:tcW w:w="0" w:type="auto"/>
+            <w:vAlign w:val="center"/>
+            <w:hideMark/>
+          </w:tcPr>
+          <w:p>
+            <w:pPr>
+              <w:rPr>
+                <w:rFonts w:ascii="Times New Roman" w:eastAsia="Times New Roman" w:hAnsi="Times New Roman" w:cs="Times New Roman"/>
+                <w:lang w:val="en-DE" w:eastAsia="en-DE"/>
+              </w:rPr>
+            </w:pPr>
+            <w:r>
+              <w:rPr>
+                <w:rFonts w:ascii="Times New Roman" w:eastAsia="Times New Roman" w:hAnsi="Times New Roman" w:cs="Times New Roman"/>
+                <w:lang w:val="en-DE" w:eastAsia="en-DE"/>
+              </w:rPr>
+              <w:t>Due to monotonic aging, any continuously pending request will eventually reach sufficient priority for selection, ensuring eventual service under fairness assumptions.</w:t>
+            </w:r>
+          </w:p>
+        </w:tc>
+        <w:tc>
+          <w:tcPr>
+            <w:tcW w:w="0" w:type="auto"/>
+            <w:vAlign w:val="center"/>
+            <w:hideMark/>
+          </w:tcPr>
+          <w:p>
+            <w:pPr>
+              <w:rPr>
+                <w:rFonts w:ascii="Times New Roman" w:eastAsia="Times New Roman" w:hAnsi="Times New Roman" w:cs="Times New Roman"/>
+                <w:lang w:val="en-DE" w:eastAsia="en-DE"/>
+              </w:rPr>
+            </w:pPr>
+            <w:r>
+              <w:rPr>
+                <w:rFonts w:ascii="Times New Roman" w:eastAsia="Times New Roman" w:hAnsi="Times New Roman" w:cs="Times New Roman"/>
+                <w:lang w:val="en-DE" w:eastAsia="en-DE"/>
+              </w:rPr>
+              <w:t>Guarantees eventual service of all persistent requests, preventing indefinite postponement under sustained load.</w:t>
+            </w:r>
+          </w:p>
+        </w:tc>
+      </w:tr>
+    </w:tbl>
+    <w:p>
+      <w:pPr>
+        <w:spacing w:after="0" w:line="240" w:lineRule="auto"/>
+        <w:rPr>
+          <w:rFonts w:ascii="Times New Roman" w:eastAsia="Times New Roman" w:hAnsi="Times New Roman" w:cs="Times New Roman"/>
+          <w:kern w:val="0"/>
+          <w:lang w:val="en-DE" w:eastAsia="en-DE"/>
+          <w14:ligatures w14:val="none"/>
+        </w:rPr>
+      </w:pPr>
+    </w:p>
+    <w:p>
+      <w:pPr>
+        <w:spacing w:before="100" w:beforeAutospacing="1" w:after="100" w:afterAutospacing="1" w:line="240" w:lineRule="auto"/>
+        <w:outlineLvl w:val="2"/>
+        <w:rPr>
+          <w:rFonts w:ascii="Times New Roman" w:eastAsia="Times New Roman" w:hAnsi="Times New Roman" w:cs="Times New Roman"/>
+          <w:b/>
+          <w:bCs/>
+          <w:kern w:val="0"/>
+          <w:sz w:val="27"/>
+          <w:szCs w:val="27"/>
+          <w:lang w:val="en-DE" w:eastAsia="en-DE"/>
+          <w14:ligatures w14:val="none"/>
+        </w:rPr>
+      </w:pPr>
+      <w:r>
+        <w:rPr>
+          <w:rFonts w:ascii="Times New Roman" w:eastAsia="Times New Roman" w:hAnsi="Times New Roman" w:cs="Times New Roman"/>
+          <w:b/>
+          <w:bCs/>
+          <w:kern w:val="0"/>
+          <w:sz w:val="27"/>
+          <w:szCs w:val="27"/>
+          <w:lang w:val="en-DE" w:eastAsia="en-DE"/>
+          <w14:ligatures w14:val="none"/>
+        </w:rPr>
+        <w:t>5. Trade-Off Analysis</w:t>
+      </w:r>
+    </w:p>
+    <w:tbl>
+      <w:tblPr>
+        <w:tblStyle w:val="TableGrid1"/>
+        <w:tblW w:w="0" w:type="auto"/>
+        <w:tblLook w:val="04A0" w:firstRow="1" w:lastRow="0" w:firstColumn="1" w:lastColumn="0" w:noHBand="0" w:noVBand="1"/>
+      </w:tblPr>
+      <w:tblGrid>
+        <w:gridCol w:w="1649"/>
+        <w:gridCol w:w="4504"/>
+        <w:gridCol w:w="2863"/>
+      </w:tblGrid>
+      <w:tr>
+        <w:tc>
+          <w:tcPr>
+            <w:tcW w:w="0" w:type="auto"/>
+            <w:vAlign w:val="center"/>
+            <w:hideMark/>
+          </w:tcPr>
+          <w:p>
+            <w:pPr>
+              <w:jc w:val="center"/>
+              <w:rPr>
+                <w:rFonts w:ascii="Times New Roman" w:eastAsia="Times New Roman" w:hAnsi="Times New Roman" w:cs="Times New Roman"/>
+                <w:b/>
+                <w:bCs/>
+                <w:lang w:val="en-DE" w:eastAsia="en-DE"/>
+              </w:rPr>
+            </w:pPr>
+            <w:r>
+              <w:rPr>
+                <w:rFonts w:ascii="Times New Roman" w:eastAsia="Times New Roman" w:hAnsi="Times New Roman" w:cs="Times New Roman"/>
+                <w:b/>
+                <w:bCs/>
+                <w:lang w:val="en-DE" w:eastAsia="en-DE"/>
+              </w:rPr>
+              <w:t>Trade-Off Dimension</w:t>
+            </w:r>
+          </w:p>
+        </w:tc>
+        <w:tc>
+          <w:tcPr>
+            <w:tcW w:w="0" w:type="auto"/>
+            <w:vAlign w:val="center"/>
+            <w:hideMark/>
+          </w:tcPr>
+          <w:p>
+            <w:pPr>
+              <w:jc w:val="center"/>
+              <w:rPr>
+                <w:rFonts w:ascii="Times New Roman" w:eastAsia="Times New Roman" w:hAnsi="Times New Roman" w:cs="Times New Roman"/>
+                <w:b/>
+                <w:bCs/>
+                <w:lang w:val="en-DE" w:eastAsia="en-DE"/>
+              </w:rPr>
+            </w:pPr>
+            <w:r>
+              <w:rPr>
+                <w:rFonts w:ascii="Times New Roman" w:eastAsia="Times New Roman" w:hAnsi="Times New Roman" w:cs="Times New Roman"/>
+                <w:b/>
+                <w:bCs/>
+                <w:lang w:val="en-DE" w:eastAsia="en-DE"/>
+              </w:rPr>
+              <w:t>Scientific Statement</w:t>
+            </w:r>
+          </w:p>
+        </w:tc>
+        <w:tc>
+          <w:tcPr>
+            <w:tcW w:w="0" w:type="auto"/>
+            <w:vAlign w:val="center"/>
+            <w:hideMark/>
+          </w:tcPr>
+          <w:p>
+            <w:pPr>
+              <w:jc w:val="center"/>
+              <w:rPr>
+                <w:rFonts w:ascii="Times New Roman" w:eastAsia="Times New Roman" w:hAnsi="Times New Roman" w:cs="Times New Roman"/>
+                <w:b/>
+                <w:bCs/>
+                <w:lang w:val="en-DE" w:eastAsia="en-DE"/>
+              </w:rPr>
+            </w:pPr>
+            <w:r>
+              <w:rPr>
+                <w:rFonts w:ascii="Times New Roman" w:eastAsia="Times New Roman" w:hAnsi="Times New Roman" w:cs="Times New Roman"/>
+                <w:b/>
+                <w:bCs/>
+                <w:lang w:val="en-DE" w:eastAsia="en-DE"/>
+              </w:rPr>
+              <w:t>Impact / Interpretation</w:t>
+            </w:r>
+          </w:p>
+        </w:tc>
+      </w:tr>
+      <w:tr>
+        <w:tc>
+          <w:tcPr>
+            <w:tcW w:w="0" w:type="auto"/>
+            <w:vAlign w:val="center"/>
+            <w:hideMark/>
+          </w:tcPr>
+          <w:p>
+            <w:pPr>
+              <w:rPr>
+                <w:rFonts w:ascii="Times New Roman" w:eastAsia="Times New Roman" w:hAnsi="Times New Roman" w:cs="Times New Roman"/>
+                <w:lang w:val="en-DE" w:eastAsia="en-DE"/>
+              </w:rPr>
+            </w:pPr>
+            <w:r>
+              <w:rPr>
+                <w:rFonts w:ascii="Times New Roman" w:eastAsia="Times New Roman" w:hAnsi="Times New Roman" w:cs="Times New Roman"/>
+                <w:lang w:val="en-DE" w:eastAsia="en-DE"/>
+              </w:rPr>
+              <w:t>Optimality vs. Real-Time Feasibility</w:t>
+            </w:r>
+          </w:p>
+        </w:tc>
+        <w:tc>
+          <w:tcPr>
+            <w:tcW w:w="0" w:type="auto"/>
+            <w:vAlign w:val="center"/>
+            <w:hideMark/>
+          </w:tcPr>
+          <w:p>
+            <w:pPr>
+              <w:jc w:val="both"/>
+              <w:rPr>
+                <w:rFonts w:ascii="Times New Roman" w:eastAsia="Times New Roman" w:hAnsi="Times New Roman" w:cs="Times New Roman"/>
+                <w:lang w:val="en-DE" w:eastAsia="en-DE"/>
+              </w:rPr>
+            </w:pPr>
+            <w:r>
+              <w:rPr>
+                <w:rFonts w:ascii="Times New Roman" w:eastAsia="Times New Roman" w:hAnsi="Times New Roman" w:cs="Times New Roman"/>
+                <w:lang w:val="en-DE" w:eastAsia="en-DE"/>
+              </w:rPr>
+              <w:t>The greedy approach does not guarantee global optimality with respect to system-wide metrics (e.g., total waiting time, throughput, or long-horizon congestion minimization). This is due to its myopic decision-making, which considers only the current system state without lookahead. Achieving global optimality would require solving a dynamic combinatorial optimization problem equivalent to repeated weighted independent set selection with temporal coupling, which is computationally intractable under real-time constraints.</w:t>
+            </w:r>
+          </w:p>
+        </w:tc>
+        <w:tc>
+          <w:tcPr>
+            <w:tcW w:w="0" w:type="auto"/>
+            <w:vAlign w:val="center"/>
+            <w:hideMark/>
+          </w:tcPr>
+          <w:p>
+            <w:pPr>
+              <w:rPr>
+                <w:rFonts w:ascii="Times New Roman" w:eastAsia="Times New Roman" w:hAnsi="Times New Roman" w:cs="Times New Roman"/>
+                <w:lang w:val="en-DE" w:eastAsia="en-DE"/>
+              </w:rPr>
+            </w:pPr>
+            <w:r>
+              <w:rPr>
+                <w:rFonts w:ascii="Times New Roman" w:eastAsia="Times New Roman" w:hAnsi="Times New Roman" w:cs="Times New Roman"/>
+                <w:lang w:val="en-DE" w:eastAsia="en-DE"/>
+              </w:rPr>
+              <w:t>Prioritizes bounded computation and embedded feasibility over global performance optimality. Ensures real-time operation at the cost of long-horizon optimal scheduling.</w:t>
+            </w:r>
+          </w:p>
+        </w:tc>
+      </w:tr>
+      <w:tr>
+        <w:tc>
+          <w:tcPr>
+            <w:tcW w:w="0" w:type="auto"/>
+            <w:vAlign w:val="center"/>
+            <w:hideMark/>
+          </w:tcPr>
+          <w:p>
+            <w:pPr>
+              <w:rPr>
+                <w:rFonts w:ascii="Times New Roman" w:eastAsia="Times New Roman" w:hAnsi="Times New Roman" w:cs="Times New Roman"/>
+                <w:lang w:val="en-DE" w:eastAsia="en-DE"/>
+              </w:rPr>
+            </w:pPr>
+            <w:r>
+              <w:rPr>
+                <w:rFonts w:ascii="Times New Roman" w:eastAsia="Times New Roman" w:hAnsi="Times New Roman" w:cs="Times New Roman"/>
+                <w:lang w:val="en-DE" w:eastAsia="en-DE"/>
+              </w:rPr>
+              <w:t>Structural Safety vs. Optimization Integration</w:t>
+            </w:r>
+          </w:p>
+        </w:tc>
+        <w:tc>
+          <w:tcPr>
+            <w:tcW w:w="0" w:type="auto"/>
+            <w:vAlign w:val="center"/>
+            <w:hideMark/>
+          </w:tcPr>
+          <w:p>
+            <w:pPr>
+              <w:jc w:val="both"/>
+              <w:rPr>
+                <w:rFonts w:ascii="Times New Roman" w:eastAsia="Times New Roman" w:hAnsi="Times New Roman" w:cs="Times New Roman"/>
+                <w:lang w:val="en-DE" w:eastAsia="en-DE"/>
+              </w:rPr>
+            </w:pPr>
+            <w:r>
+              <w:rPr>
+                <w:rFonts w:ascii="Times New Roman" w:eastAsia="Times New Roman" w:hAnsi="Times New Roman" w:cs="Times New Roman"/>
+                <w:lang w:val="en-DE" w:eastAsia="en-DE"/>
+              </w:rPr>
+              <w:t>Safety constraints are decoupled from the scoring function and enforced at the execution layer. While this guarantees strong correctness properties, it prevents joint optimization of safety and performance within a unified objective function. This separation reduces model complexity and improves verifiability.</w:t>
+            </w:r>
+          </w:p>
+        </w:tc>
+        <w:tc>
+          <w:tcPr>
+            <w:tcW w:w="0" w:type="auto"/>
+            <w:vAlign w:val="center"/>
+            <w:hideMark/>
+          </w:tcPr>
+          <w:p>
+            <w:pPr>
+              <w:rPr>
+                <w:rFonts w:ascii="Times New Roman" w:eastAsia="Times New Roman" w:hAnsi="Times New Roman" w:cs="Times New Roman"/>
+                <w:lang w:val="en-DE" w:eastAsia="en-DE"/>
+              </w:rPr>
+            </w:pPr>
+            <w:r>
+              <w:rPr>
+                <w:rFonts w:ascii="Times New Roman" w:eastAsia="Times New Roman" w:hAnsi="Times New Roman" w:cs="Times New Roman"/>
+                <w:lang w:val="en-DE" w:eastAsia="en-DE"/>
+              </w:rPr>
+              <w:t>Improves formal verification and safety guarantees, but limits global resource optimization due to decoupled decision layers.</w:t>
+            </w:r>
+          </w:p>
+        </w:tc>
+      </w:tr>
+      <w:tr>
+        <w:tc>
+          <w:tcPr>
+            <w:tcW w:w="0" w:type="auto"/>
+            <w:vAlign w:val="center"/>
+            <w:hideMark/>
+          </w:tcPr>
+          <w:p>
+            <w:pPr>
+              <w:rPr>
+                <w:rFonts w:ascii="Times New Roman" w:eastAsia="Times New Roman" w:hAnsi="Times New Roman" w:cs="Times New Roman"/>
+                <w:lang w:val="en-DE" w:eastAsia="en-DE"/>
+              </w:rPr>
+            </w:pPr>
+            <w:r>
+              <w:rPr>
+                <w:rFonts w:ascii="Times New Roman" w:eastAsia="Times New Roman" w:hAnsi="Times New Roman" w:cs="Times New Roman"/>
+                <w:lang w:val="en-DE" w:eastAsia="en-DE"/>
+              </w:rPr>
+              <w:lastRenderedPageBreak/>
+              <w:t>Determinism vs. Flexibility</w:t>
+            </w:r>
+          </w:p>
+        </w:tc>
+        <w:tc>
+          <w:tcPr>
+            <w:tcW w:w="0" w:type="auto"/>
+            <w:vAlign w:val="center"/>
+            <w:hideMark/>
+          </w:tcPr>
+          <w:p>
+            <w:pPr>
+              <w:jc w:val="both"/>
+              <w:rPr>
+                <w:rFonts w:ascii="Times New Roman" w:eastAsia="Times New Roman" w:hAnsi="Times New Roman" w:cs="Times New Roman"/>
+                <w:lang w:val="en-DE" w:eastAsia="en-DE"/>
+              </w:rPr>
+            </w:pPr>
+            <w:r>
+              <w:rPr>
+                <w:rFonts w:ascii="Times New Roman" w:eastAsia="Times New Roman" w:hAnsi="Times New Roman" w:cs="Times New Roman"/>
+                <w:lang w:val="en-DE" w:eastAsia="en-DE"/>
+              </w:rPr>
+              <w:t>The scheduler is deterministic, improving reproducibility and formal verifiability. However, this reduces flexibility in resolving equivalent priority cases and may introduce structural bias based on evaluation order.</w:t>
+            </w:r>
+          </w:p>
+        </w:tc>
+        <w:tc>
+          <w:tcPr>
+            <w:tcW w:w="0" w:type="auto"/>
+            <w:vAlign w:val="center"/>
+            <w:hideMark/>
+          </w:tcPr>
+          <w:p>
+            <w:pPr>
+              <w:rPr>
+                <w:rFonts w:ascii="Times New Roman" w:eastAsia="Times New Roman" w:hAnsi="Times New Roman" w:cs="Times New Roman"/>
+                <w:lang w:val="en-DE" w:eastAsia="en-DE"/>
+              </w:rPr>
+            </w:pPr>
+            <w:r>
+              <w:rPr>
+                <w:rFonts w:ascii="Times New Roman" w:eastAsia="Times New Roman" w:hAnsi="Times New Roman" w:cs="Times New Roman"/>
+                <w:lang w:val="en-DE" w:eastAsia="en-DE"/>
+              </w:rPr>
+              <w:t xml:space="preserve">Ensures predictable and verifiable </w:t>
+            </w:r>
+            <w:proofErr w:type="spellStart"/>
+            <w:r>
+              <w:rPr>
+                <w:rFonts w:ascii="Times New Roman" w:eastAsia="Times New Roman" w:hAnsi="Times New Roman" w:cs="Times New Roman"/>
+                <w:lang w:val="en-DE" w:eastAsia="en-DE"/>
+              </w:rPr>
+              <w:t>behavior</w:t>
+            </w:r>
+            <w:proofErr w:type="spellEnd"/>
+            <w:r>
+              <w:rPr>
+                <w:rFonts w:ascii="Times New Roman" w:eastAsia="Times New Roman" w:hAnsi="Times New Roman" w:cs="Times New Roman"/>
+                <w:lang w:val="en-DE" w:eastAsia="en-DE"/>
+              </w:rPr>
+              <w:t>, but sacrifices adaptive or stochastic optimization strategies and introduces potential deterministic bias.</w:t>
+            </w:r>
+          </w:p>
+        </w:tc>
+      </w:tr>
+      <w:tr>
+        <w:tc>
+          <w:tcPr>
+            <w:tcW w:w="0" w:type="auto"/>
+            <w:vAlign w:val="center"/>
+            <w:hideMark/>
+          </w:tcPr>
+          <w:p>
+            <w:pPr>
+              <w:rPr>
+                <w:rFonts w:ascii="Times New Roman" w:eastAsia="Times New Roman" w:hAnsi="Times New Roman" w:cs="Times New Roman"/>
+                <w:lang w:val="en-DE" w:eastAsia="en-DE"/>
+              </w:rPr>
+            </w:pPr>
+            <w:r>
+              <w:rPr>
+                <w:rFonts w:ascii="Times New Roman" w:eastAsia="Times New Roman" w:hAnsi="Times New Roman" w:cs="Times New Roman"/>
+                <w:lang w:val="en-DE" w:eastAsia="en-DE"/>
+              </w:rPr>
+              <w:t>Local Optimality vs. Global Optimality</w:t>
+            </w:r>
+          </w:p>
+        </w:tc>
+        <w:tc>
+          <w:tcPr>
+            <w:tcW w:w="0" w:type="auto"/>
+            <w:vAlign w:val="center"/>
+            <w:hideMark/>
+          </w:tcPr>
+          <w:p>
+            <w:pPr>
+              <w:jc w:val="both"/>
+              <w:rPr>
+                <w:rFonts w:ascii="Times New Roman" w:eastAsia="Times New Roman" w:hAnsi="Times New Roman" w:cs="Times New Roman"/>
+                <w:lang w:val="en-DE" w:eastAsia="en-DE"/>
+              </w:rPr>
+            </w:pPr>
+            <w:r>
+              <w:rPr>
+                <w:rFonts w:ascii="Times New Roman" w:eastAsia="Times New Roman" w:hAnsi="Times New Roman" w:cs="Times New Roman"/>
+                <w:lang w:val="en-DE" w:eastAsia="en-DE"/>
+              </w:rPr>
+              <w:t>Each scheduling decision is locally optimal with respect to the instantaneous scoring function. However, the absence of future-state evaluation prevents global optimality over time horizons. This limitation is inherent to greedy scheduling in dynamic systems but is mitigated through aging and conflict-aware execution constraints.</w:t>
+            </w:r>
+          </w:p>
+        </w:tc>
+        <w:tc>
+          <w:tcPr>
+            <w:tcW w:w="0" w:type="auto"/>
+            <w:vAlign w:val="center"/>
+            <w:hideMark/>
+          </w:tcPr>
+          <w:p>
+            <w:pPr>
+              <w:rPr>
+                <w:rFonts w:ascii="Times New Roman" w:eastAsia="Times New Roman" w:hAnsi="Times New Roman" w:cs="Times New Roman"/>
+                <w:lang w:val="en-DE" w:eastAsia="en-DE"/>
+              </w:rPr>
+            </w:pPr>
+            <w:r>
+              <w:rPr>
+                <w:rFonts w:ascii="Times New Roman" w:eastAsia="Times New Roman" w:hAnsi="Times New Roman" w:cs="Times New Roman"/>
+                <w:lang w:val="en-DE" w:eastAsia="en-DE"/>
+              </w:rPr>
+              <w:t>Ensures efficient per-step decisions, but does not guarantee globally optimal system-wide performance over time.</w:t>
+            </w:r>
+          </w:p>
+        </w:tc>
+      </w:tr>
+    </w:tbl>
+    <w:p>
+      <w:pPr>
+        <w:spacing w:after="0" w:line="240" w:lineRule="auto"/>
+        <w:rPr>
+          <w:rFonts w:ascii="Times New Roman" w:eastAsia="Times New Roman" w:hAnsi="Times New Roman" w:cs="Times New Roman"/>
+          <w:kern w:val="0"/>
+          <w:lang w:val="en-DE" w:eastAsia="en-DE"/>
+          <w14:ligatures w14:val="none"/>
+        </w:rPr>
+      </w:pPr>
+    </w:p>
+    <w:p>
+      <w:pPr>
+        <w:spacing w:before="100" w:beforeAutospacing="1" w:after="100" w:afterAutospacing="1" w:line="240" w:lineRule="auto"/>
+        <w:outlineLvl w:val="2"/>
+        <w:rPr>
+          <w:rFonts w:ascii="Times New Roman" w:eastAsia="Times New Roman" w:hAnsi="Times New Roman" w:cs="Times New Roman"/>
+          <w:b/>
+          <w:bCs/>
+          <w:kern w:val="0"/>
+          <w:sz w:val="27"/>
+          <w:szCs w:val="27"/>
+          <w:lang w:val="en-DE" w:eastAsia="en-DE"/>
+          <w14:ligatures w14:val="none"/>
+        </w:rPr>
+      </w:pPr>
+      <w:r>
+        <w:rPr>
+          <w:rFonts w:ascii="Times New Roman" w:eastAsia="Times New Roman" w:hAnsi="Times New Roman" w:cs="Times New Roman"/>
+          <w:b/>
+          <w:bCs/>
+          <w:kern w:val="0"/>
+          <w:sz w:val="27"/>
+          <w:szCs w:val="27"/>
+          <w:lang w:val="en-DE" w:eastAsia="en-DE"/>
+          <w14:ligatures w14:val="none"/>
+        </w:rPr>
+        <w:t>6. Justification of Design Choice</w:t>
+      </w:r>
+    </w:p>
+    <w:p>
+      <w:pPr>
+        <w:spacing w:before="100" w:beforeAutospacing="1" w:after="100" w:afterAutospacing="1" w:line="240" w:lineRule="auto"/>
+        <w:rPr>
+          <w:rFonts w:ascii="Times New Roman" w:eastAsia="Times New Roman" w:hAnsi="Times New Roman" w:cs="Times New Roman"/>
+          <w:kern w:val="0"/>
+          <w:lang w:val="en-DE" w:eastAsia="en-DE"/>
+          <w14:ligatures w14:val="none"/>
+        </w:rPr>
+      </w:pPr>
+      <w:r>
+        <w:rPr>
+          <w:rFonts w:ascii="Times New Roman" w:eastAsia="Times New Roman" w:hAnsi="Times New Roman" w:cs="Times New Roman"/>
+          <w:kern w:val="0"/>
+          <w:lang w:val="en-DE" w:eastAsia="en-DE"/>
+          <w14:ligatures w14:val="none"/>
+        </w:rPr>
+        <w:t xml:space="preserve">The selection of a greedy, aging-based scheduling strategy is </w:t>
+      </w:r>
+      <w:r>
+        <w:rPr>
+          <w:rFonts w:ascii="Times New Roman" w:eastAsia="Times New Roman" w:hAnsi="Times New Roman" w:cs="Times New Roman"/>
+          <w:kern w:val="0"/>
+          <w:lang w:val="en-DE" w:eastAsia="en-DE"/>
+          <w14:ligatures w14:val="none"/>
+        </w:rPr>
+        <w:t xml:space="preserve">selected </w:t>
+      </w:r>
+      <w:r>
+        <w:rPr>
+          <w:rFonts w:ascii="Times New Roman" w:eastAsia="Times New Roman" w:hAnsi="Times New Roman" w:cs="Times New Roman"/>
+          <w:kern w:val="0"/>
+          <w:lang w:val="en-DE" w:eastAsia="en-DE"/>
+          <w14:ligatures w14:val="none"/>
+        </w:rPr>
+        <w:t xml:space="preserve">for </w:t>
+      </w:r>
+      <w:r>
+        <w:rPr>
+          <w:rFonts w:ascii="Times New Roman" w:eastAsia="Times New Roman" w:hAnsi="Times New Roman" w:cs="Times New Roman"/>
+          <w:kern w:val="0"/>
+          <w:lang w:val="en-DE" w:eastAsia="en-DE"/>
+          <w14:ligatures w14:val="none"/>
+        </w:rPr>
+        <w:t>the</w:t>
+      </w:r>
+      <w:r>
+        <w:rPr>
+          <w:rFonts w:ascii="Times New Roman" w:eastAsia="Times New Roman" w:hAnsi="Times New Roman" w:cs="Times New Roman"/>
+          <w:kern w:val="0"/>
+          <w:lang w:val="en-DE" w:eastAsia="en-DE"/>
+          <w14:ligatures w14:val="none"/>
+        </w:rPr>
+        <w:t xml:space="preserve"> following system constraints:</w:t>
+      </w:r>
+    </w:p>
+    <w:p>
+      <w:pPr>
+        <w:numPr>
+          <w:ilvl w:val="0"/>
+          <w:numId w:val="9"/>
+        </w:numPr>
+        <w:spacing w:before="100" w:beforeAutospacing="1" w:after="100" w:afterAutospacing="1" w:line="240" w:lineRule="auto"/>
+        <w:rPr>
+          <w:rFonts w:ascii="Times New Roman" w:eastAsia="Times New Roman" w:hAnsi="Times New Roman" w:cs="Times New Roman"/>
+          <w:kern w:val="0"/>
+          <w:lang w:val="en-DE" w:eastAsia="en-DE"/>
+          <w14:ligatures w14:val="none"/>
+        </w:rPr>
+      </w:pPr>
+      <w:r>
+        <w:rPr>
+          <w:rFonts w:ascii="Times New Roman" w:eastAsia="Times New Roman" w:hAnsi="Times New Roman" w:cs="Times New Roman"/>
+          <w:kern w:val="0"/>
+          <w:lang w:val="en-DE" w:eastAsia="en-DE"/>
+          <w14:ligatures w14:val="none"/>
+        </w:rPr>
+        <w:t xml:space="preserve">Strict real-time deadlines requiring bounded computation </w:t>
+      </w:r>
+    </w:p>
+    <w:p>
+      <w:pPr>
+        <w:numPr>
+          <w:ilvl w:val="0"/>
+          <w:numId w:val="9"/>
+        </w:numPr>
+        <w:spacing w:before="100" w:beforeAutospacing="1" w:after="100" w:afterAutospacing="1" w:line="240" w:lineRule="auto"/>
+        <w:rPr>
+          <w:rFonts w:ascii="Times New Roman" w:eastAsia="Times New Roman" w:hAnsi="Times New Roman" w:cs="Times New Roman"/>
+          <w:kern w:val="0"/>
+          <w:lang w:val="en-DE" w:eastAsia="en-DE"/>
+          <w14:ligatures w14:val="none"/>
+        </w:rPr>
+      </w:pPr>
+      <w:r>
+        <w:rPr>
+          <w:rFonts w:ascii="Times New Roman" w:eastAsia="Times New Roman" w:hAnsi="Times New Roman" w:cs="Times New Roman"/>
+          <w:kern w:val="0"/>
+          <w:lang w:val="en-DE" w:eastAsia="en-DE"/>
+          <w14:ligatures w14:val="none"/>
+        </w:rPr>
+        <w:t xml:space="preserve">Embedded execution constraints limiting algorithmic complexity </w:t>
+      </w:r>
+    </w:p>
+    <w:p>
+      <w:pPr>
+        <w:numPr>
+          <w:ilvl w:val="0"/>
+          <w:numId w:val="9"/>
+        </w:numPr>
+        <w:spacing w:before="100" w:beforeAutospacing="1" w:after="100" w:afterAutospacing="1" w:line="240" w:lineRule="auto"/>
+        <w:rPr>
+          <w:rFonts w:ascii="Times New Roman" w:eastAsia="Times New Roman" w:hAnsi="Times New Roman" w:cs="Times New Roman"/>
+          <w:kern w:val="0"/>
+          <w:lang w:val="en-DE" w:eastAsia="en-DE"/>
+          <w14:ligatures w14:val="none"/>
+        </w:rPr>
+      </w:pPr>
+      <w:r>
+        <w:rPr>
+          <w:rFonts w:ascii="Times New Roman" w:eastAsia="Times New Roman" w:hAnsi="Times New Roman" w:cs="Times New Roman"/>
+          <w:kern w:val="0"/>
+          <w:lang w:val="en-DE" w:eastAsia="en-DE"/>
+          <w14:ligatures w14:val="none"/>
+        </w:rPr>
+        <w:t xml:space="preserve">Requirement for deterministic </w:t>
+      </w:r>
+      <w:proofErr w:type="spellStart"/>
+      <w:r>
+        <w:rPr>
+          <w:rFonts w:ascii="Times New Roman" w:eastAsia="Times New Roman" w:hAnsi="Times New Roman" w:cs="Times New Roman"/>
+          <w:kern w:val="0"/>
+          <w:lang w:val="en-DE" w:eastAsia="en-DE"/>
+          <w14:ligatures w14:val="none"/>
+        </w:rPr>
+        <w:t>behavior</w:t>
+      </w:r>
+      <w:proofErr w:type="spellEnd"/>
+      <w:r>
+        <w:rPr>
+          <w:rFonts w:ascii="Times New Roman" w:eastAsia="Times New Roman" w:hAnsi="Times New Roman" w:cs="Times New Roman"/>
+          <w:kern w:val="0"/>
+          <w:lang w:val="en-DE" w:eastAsia="en-DE"/>
+          <w14:ligatures w14:val="none"/>
+        </w:rPr>
+        <w:t xml:space="preserve"> under formal verification </w:t>
+      </w:r>
+    </w:p>
+    <w:p>
+      <w:pPr>
+        <w:numPr>
+          <w:ilvl w:val="0"/>
+          <w:numId w:val="9"/>
+        </w:numPr>
+        <w:spacing w:before="100" w:beforeAutospacing="1" w:after="100" w:afterAutospacing="1" w:line="240" w:lineRule="auto"/>
+        <w:rPr>
+          <w:rFonts w:ascii="Times New Roman" w:eastAsia="Times New Roman" w:hAnsi="Times New Roman" w:cs="Times New Roman"/>
+          <w:kern w:val="0"/>
+          <w:lang w:val="en-DE" w:eastAsia="en-DE"/>
+          <w14:ligatures w14:val="none"/>
+        </w:rPr>
+      </w:pPr>
+      <w:r>
+        <w:rPr>
+          <w:rFonts w:ascii="Times New Roman" w:eastAsia="Times New Roman" w:hAnsi="Times New Roman" w:cs="Times New Roman"/>
+          <w:kern w:val="0"/>
+          <w:lang w:val="en-DE" w:eastAsia="en-DE"/>
+          <w14:ligatures w14:val="none"/>
+        </w:rPr>
+        <w:t xml:space="preserve">Hard safety constraints requiring explicit conflict avoidance </w:t>
+      </w:r>
+    </w:p>
+    <w:p>
+      <w:pPr>
+        <w:numPr>
+          <w:ilvl w:val="0"/>
+          <w:numId w:val="9"/>
+        </w:numPr>
+        <w:spacing w:before="100" w:beforeAutospacing="1" w:after="100" w:afterAutospacing="1" w:line="240" w:lineRule="auto"/>
+        <w:rPr>
+          <w:rFonts w:ascii="Times New Roman" w:eastAsia="Times New Roman" w:hAnsi="Times New Roman" w:cs="Times New Roman"/>
+          <w:kern w:val="0"/>
+          <w:lang w:val="en-DE" w:eastAsia="en-DE"/>
+          <w14:ligatures w14:val="none"/>
+        </w:rPr>
+      </w:pPr>
+      <w:r>
+        <w:rPr>
+          <w:rFonts w:ascii="Times New Roman" w:eastAsia="Times New Roman" w:hAnsi="Times New Roman" w:cs="Times New Roman"/>
+          <w:kern w:val="0"/>
+          <w:lang w:val="en-DE" w:eastAsia="en-DE"/>
+          <w14:ligatures w14:val="none"/>
+        </w:rPr>
+        <w:t xml:space="preserve">Dynamic and partially observable system state </w:t>
+      </w:r>
+    </w:p>
+    <w:p>
+      <w:pPr>
+        <w:spacing w:before="100" w:beforeAutospacing="1" w:after="100" w:afterAutospacing="1" w:line="240" w:lineRule="auto"/>
+        <w:jc w:val="both"/>
+        <w:rPr>
+          <w:rFonts w:ascii="Times New Roman" w:eastAsia="Times New Roman" w:hAnsi="Times New Roman" w:cs="Times New Roman"/>
+          <w:kern w:val="0"/>
+          <w:lang w:val="en-DE" w:eastAsia="en-DE"/>
+          <w14:ligatures w14:val="none"/>
+        </w:rPr>
+      </w:pPr>
+      <w:r>
+        <w:rPr>
+          <w:rFonts w:ascii="Times New Roman" w:eastAsia="Times New Roman" w:hAnsi="Times New Roman" w:cs="Times New Roman"/>
+          <w:kern w:val="0"/>
+          <w:lang w:val="en-DE" w:eastAsia="en-DE"/>
+          <w14:ligatures w14:val="none"/>
+        </w:rPr>
+        <w:t xml:space="preserve">Within this context, greedy scheduling represents a </w:t>
+      </w:r>
+      <w:r>
+        <w:rPr>
+          <w:rFonts w:ascii="Times New Roman" w:eastAsia="Times New Roman" w:hAnsi="Times New Roman" w:cs="Times New Roman"/>
+          <w:b/>
+          <w:bCs/>
+          <w:kern w:val="0"/>
+          <w:lang w:val="en-DE" w:eastAsia="en-DE"/>
+          <w14:ligatures w14:val="none"/>
+        </w:rPr>
+        <w:t>pragmatic optimality under constraints</w:t>
+      </w:r>
+      <w:r>
+        <w:rPr>
+          <w:rFonts w:ascii="Times New Roman" w:eastAsia="Times New Roman" w:hAnsi="Times New Roman" w:cs="Times New Roman"/>
+          <w:kern w:val="0"/>
+          <w:lang w:val="en-DE" w:eastAsia="en-DE"/>
+          <w14:ligatures w14:val="none"/>
+        </w:rPr>
+        <w:t>, where the objective shifts from maximizing performance to guaranteeing correctness, safety, and feasibility.</w:t>
+      </w:r>
+      <w:r>
+        <w:rPr>
+          <w:rFonts w:ascii="Times New Roman" w:eastAsia="Times New Roman" w:hAnsi="Times New Roman" w:cs="Times New Roman"/>
+          <w:kern w:val="0"/>
+          <w:lang w:val="en-DE" w:eastAsia="en-DE"/>
+          <w14:ligatures w14:val="none"/>
+        </w:rPr>
+        <w:t xml:space="preserve"> </w:t>
+      </w:r>
+      <w:r>
+        <w:rPr>
+          <w:rFonts w:ascii="Times New Roman" w:eastAsia="Times New Roman" w:hAnsi="Times New Roman" w:cs="Times New Roman"/>
+          <w:kern w:val="0"/>
+          <w:lang w:val="en-DE" w:eastAsia="en-DE"/>
+          <w14:ligatures w14:val="none"/>
+        </w:rPr>
+        <w:t xml:space="preserve">The presented scheduling approach is a </w:t>
+      </w:r>
+      <w:r>
+        <w:rPr>
+          <w:rFonts w:ascii="Times New Roman" w:eastAsia="Times New Roman" w:hAnsi="Times New Roman" w:cs="Times New Roman"/>
+          <w:b/>
+          <w:bCs/>
+          <w:kern w:val="0"/>
+          <w:lang w:val="en-DE" w:eastAsia="en-DE"/>
+          <w14:ligatures w14:val="none"/>
+        </w:rPr>
+        <w:t>deterministic, real-time feasible, conflict-aware greedy heuristic with aging-based fairness</w:t>
+      </w:r>
+      <w:r>
+        <w:rPr>
+          <w:rFonts w:ascii="Times New Roman" w:eastAsia="Times New Roman" w:hAnsi="Times New Roman" w:cs="Times New Roman"/>
+          <w:kern w:val="0"/>
+          <w:lang w:val="en-DE" w:eastAsia="en-DE"/>
+          <w14:ligatures w14:val="none"/>
+        </w:rPr>
+        <w:t>, designed specifically for safety-critical intersection management under formal verification constraints. While it does not achieve global optimality in classical optimization terms, it provides strong guarantees in safety, bounded execution, and determinism, which are primary requirements in embedded autonomous coordination systems.</w:t>
+      </w:r>
+    </w:p>
+    <w:p>
+      <w:pPr>
+        <w:spacing w:after="0" w:line="240" w:lineRule="auto"/>
         <w:rPr>
           <w:rFonts w:ascii="Times New Roman" w:eastAsia="Times New Roman" w:hAnsi="Times New Roman" w:cs="Times New Roman"/>
           <w:b/>
@@ -20071,7 +22523,10 @@
           <w14:ligatures w14:val="none"/>
         </w:rPr>
       </w:pPr>
-      <w:r>
+    </w:p>
+    <w:p>
+      <w:pPr>
+        <w:spacing w:after="0" w:line="240" w:lineRule="auto"/>
         <w:rPr>
           <w:rFonts w:ascii="Times New Roman" w:eastAsia="Times New Roman" w:hAnsi="Times New Roman" w:cs="Times New Roman"/>
           <w:b/>
@@ -20082,13 +22537,11 @@
           <w:lang w:eastAsia="en-DE"/>
           <w14:ligatures w14:val="none"/>
         </w:rPr>
-        <w:t>5.2 Adaptive Scheduling</w:t>
-      </w:r>
-    </w:p>
-    <w:p>
-      <w:pPr>
-        <w:spacing w:before="100" w:beforeAutospacing="1" w:after="100" w:afterAutospacing="1" w:line="240" w:lineRule="auto"/>
-        <w:outlineLvl w:val="1"/>
+      </w:pPr>
+    </w:p>
+    <w:p>
+      <w:pPr>
+        <w:spacing w:after="0" w:line="240" w:lineRule="auto"/>
         <w:rPr>
           <w:rFonts w:ascii="Times New Roman" w:eastAsia="Times New Roman" w:hAnsi="Times New Roman" w:cs="Times New Roman"/>
           <w:b/>
@@ -20100,7 +22553,10 @@
           <w14:ligatures w14:val="none"/>
         </w:rPr>
       </w:pPr>
-      <w:r>
+    </w:p>
+    <w:p>
+      <w:pPr>
+        <w:spacing w:after="0" w:line="240" w:lineRule="auto"/>
         <w:rPr>
           <w:rFonts w:ascii="Times New Roman" w:eastAsia="Times New Roman" w:hAnsi="Times New Roman" w:cs="Times New Roman"/>
           <w:b/>
@@ -20111,13 +22567,11 @@
           <w:lang w:eastAsia="en-DE"/>
           <w14:ligatures w14:val="none"/>
         </w:rPr>
-        <w:t>5.3 Priority-Based Scheduling</w:t>
-      </w:r>
-    </w:p>
-    <w:p>
-      <w:pPr>
-        <w:spacing w:before="100" w:beforeAutospacing="1" w:after="100" w:afterAutospacing="1" w:line="240" w:lineRule="auto"/>
-        <w:outlineLvl w:val="1"/>
+      </w:pPr>
+    </w:p>
+    <w:p>
+      <w:pPr>
+        <w:spacing w:after="0" w:line="240" w:lineRule="auto"/>
         <w:rPr>
           <w:rFonts w:ascii="Times New Roman" w:eastAsia="Times New Roman" w:hAnsi="Times New Roman" w:cs="Times New Roman"/>
           <w:b/>
@@ -20129,7 +22583,10 @@
           <w14:ligatures w14:val="none"/>
         </w:rPr>
       </w:pPr>
-      <w:r>
+    </w:p>
+    <w:p>
+      <w:pPr>
+        <w:spacing w:after="0" w:line="240" w:lineRule="auto"/>
         <w:rPr>
           <w:rFonts w:ascii="Times New Roman" w:eastAsia="Times New Roman" w:hAnsi="Times New Roman" w:cs="Times New Roman"/>
           <w:b/>
@@ -20140,13 +22597,11 @@
           <w:lang w:eastAsia="en-DE"/>
           <w14:ligatures w14:val="none"/>
         </w:rPr>
-        <w:t>5.4 Reservation-Based Scheduling</w:t>
-      </w:r>
-    </w:p>
-    <w:p>
-      <w:pPr>
-        <w:spacing w:before="100" w:beforeAutospacing="1" w:after="100" w:afterAutospacing="1" w:line="240" w:lineRule="auto"/>
-        <w:outlineLvl w:val="1"/>
+      </w:pPr>
+    </w:p>
+    <w:p>
+      <w:pPr>
+        <w:spacing w:after="0" w:line="240" w:lineRule="auto"/>
         <w:rPr>
           <w:rFonts w:ascii="Times New Roman" w:eastAsia="Times New Roman" w:hAnsi="Times New Roman" w:cs="Times New Roman"/>
           <w:b/>
@@ -20158,7 +22613,10 @@
           <w14:ligatures w14:val="none"/>
         </w:rPr>
       </w:pPr>
-      <w:r>
+    </w:p>
+    <w:p>
+      <w:pPr>
+        <w:spacing w:after="0" w:line="240" w:lineRule="auto"/>
         <w:rPr>
           <w:rFonts w:ascii="Times New Roman" w:eastAsia="Times New Roman" w:hAnsi="Times New Roman" w:cs="Times New Roman"/>
           <w:b/>
@@ -20169,13 +22627,11 @@
           <w:lang w:eastAsia="en-DE"/>
           <w14:ligatures w14:val="none"/>
         </w:rPr>
-        <w:t>5.5 Emergency Vehicle Prioritization</w:t>
-      </w:r>
-    </w:p>
-    <w:p>
-      <w:pPr>
-        <w:spacing w:before="100" w:beforeAutospacing="1" w:after="100" w:afterAutospacing="1" w:line="240" w:lineRule="auto"/>
-        <w:outlineLvl w:val="1"/>
+      </w:pPr>
+    </w:p>
+    <w:p>
+      <w:pPr>
+        <w:spacing w:after="0" w:line="240" w:lineRule="auto"/>
         <w:rPr>
           <w:rFonts w:ascii="Times New Roman" w:eastAsia="Times New Roman" w:hAnsi="Times New Roman" w:cs="Times New Roman"/>
           <w:b/>
@@ -20187,7 +22643,10 @@
           <w14:ligatures w14:val="none"/>
         </w:rPr>
       </w:pPr>
-      <w:r>
+    </w:p>
+    <w:p>
+      <w:pPr>
+        <w:spacing w:after="0" w:line="240" w:lineRule="auto"/>
         <w:rPr>
           <w:rFonts w:ascii="Times New Roman" w:eastAsia="Times New Roman" w:hAnsi="Times New Roman" w:cs="Times New Roman"/>
           <w:b/>
@@ -20198,38 +22657,7 @@
           <w:lang w:eastAsia="en-DE"/>
           <w14:ligatures w14:val="none"/>
         </w:rPr>
-        <w:t>5.6 Comparative Evaluation</w:t>
-      </w:r>
-    </w:p>
-    <w:p>
-      <w:pPr>
-        <w:spacing w:before="100" w:beforeAutospacing="1" w:after="100" w:afterAutospacing="1" w:line="240" w:lineRule="auto"/>
-        <w:outlineLvl w:val="1"/>
-        <w:rPr>
-          <w:rFonts w:ascii="Times New Roman" w:eastAsia="Times New Roman" w:hAnsi="Times New Roman" w:cs="Times New Roman"/>
-          <w:b/>
-          <w:bCs/>
-          <w:kern w:val="0"/>
-          <w:sz w:val="36"/>
-          <w:szCs w:val="36"/>
-          <w:lang w:eastAsia="en-DE"/>
-          <w14:ligatures w14:val="none"/>
-        </w:rPr>
-      </w:pPr>
-      <w:r>
-        <w:rPr>
-          <w:rFonts w:ascii="Times New Roman" w:eastAsia="Times New Roman" w:hAnsi="Times New Roman" w:cs="Times New Roman"/>
-          <w:b/>
-          <w:bCs/>
-          <w:kern w:val="0"/>
-          <w:sz w:val="36"/>
-          <w:szCs w:val="36"/>
-          <w:lang w:eastAsia="en-DE"/>
-          <w14:ligatures w14:val="none"/>
-        </w:rPr>
-        <w:lastRenderedPageBreak/>
-        <w:t>5.7 Selected Control Strategy</w:t>
-      </w:r>
+      </w:pPr>
     </w:p>
     <w:p>
       <w:pPr>
@@ -20241,17 +22669,6 @@
           <w14:ligatures w14:val="none"/>
         </w:rPr>
       </w:pPr>
-      <w:r>
-        <w:rPr>
-          <w:rFonts w:ascii="Times New Roman" w:eastAsia="Times New Roman" w:hAnsi="Times New Roman" w:cs="Times New Roman"/>
-          <w:kern w:val="0"/>
-          <w:lang w:eastAsia="en-DE"/>
-          <w14:ligatures w14:val="none"/>
-        </w:rPr>
-        <w:pict w14:anchorId="5287B1EF">
-          <v:rect id="_x0000_i1026" style="width:0;height:1.5pt" o:hralign="center" o:hrstd="t" o:hr="t" fillcolor="#a0a0a0" stroked="f"/>
-        </w:pict>
-      </w:r>
     </w:p>
     <w:p>
       <w:pPr>
@@ -20279,6 +22696,7 @@
           <w:lang w:eastAsia="en-DE"/>
           <w14:ligatures w14:val="none"/>
         </w:rPr>
+        <w:lastRenderedPageBreak/>
         <w:t>Chapter 6 – Formal Verification Using UPPAAL</w:t>
       </w:r>
     </w:p>
@@ -20687,6 +23105,22 @@
         </w:rPr>
         <w:t>6.8 Verification Results</w:t>
       </w:r>
+    </w:p>
+    <w:p>
+      <w:pPr>
+        <w:spacing w:before="100" w:beforeAutospacing="1" w:after="100" w:afterAutospacing="1" w:line="240" w:lineRule="auto"/>
+        <w:outlineLvl w:val="1"/>
+        <w:rPr>
+          <w:rFonts w:ascii="Times New Roman" w:eastAsia="Times New Roman" w:hAnsi="Times New Roman" w:cs="Times New Roman"/>
+          <w:b/>
+          <w:bCs/>
+          <w:kern w:val="0"/>
+          <w:sz w:val="36"/>
+          <w:szCs w:val="36"/>
+          <w:lang w:eastAsia="en-DE"/>
+          <w14:ligatures w14:val="none"/>
+        </w:rPr>
+      </w:pPr>
     </w:p>
     <w:p>
       <w:pPr>
@@ -20765,7 +23199,6 @@
           <w:lang w:eastAsia="en-DE"/>
           <w14:ligatures w14:val="none"/>
         </w:rPr>
-        <w:lastRenderedPageBreak/>
         <w:t>7.1 Real-Time Requirements</w:t>
       </w:r>
     </w:p>
@@ -20795,7 +23228,36 @@
           <w:lang w:eastAsia="en-DE"/>
           <w14:ligatures w14:val="none"/>
         </w:rPr>
-        <w:t>7.2 FreeRTOS Architecture</w:t>
+        <w:lastRenderedPageBreak/>
+        <w:t xml:space="preserve">7.2 </w:t>
+      </w:r>
+      <w:proofErr w:type="spellStart"/>
+      <w:r>
+        <w:rPr>
+          <w:rFonts w:ascii="Times New Roman" w:eastAsia="Times New Roman" w:hAnsi="Times New Roman" w:cs="Times New Roman"/>
+          <w:b/>
+          <w:bCs/>
+          <w:kern w:val="0"/>
+          <w:sz w:val="36"/>
+          <w:szCs w:val="36"/>
+          <w:lang w:eastAsia="en-DE"/>
+          <w14:ligatures w14:val="none"/>
+        </w:rPr>
+        <w:t>FreeRTOS</w:t>
+      </w:r>
+      <w:proofErr w:type="spellEnd"/>
+      <w:r>
+        <w:rPr>
+          <w:rFonts w:ascii="Times New Roman" w:eastAsia="Times New Roman" w:hAnsi="Times New Roman" w:cs="Times New Roman"/>
+          <w:b/>
+          <w:bCs/>
+          <w:kern w:val="0"/>
+          <w:sz w:val="36"/>
+          <w:szCs w:val="36"/>
+          <w:lang w:eastAsia="en-DE"/>
+          <w14:ligatures w14:val="none"/>
+        </w:rPr>
+        <w:t xml:space="preserve"> Architecture</w:t>
       </w:r>
     </w:p>
     <w:p>
@@ -21397,7 +23859,6 @@
           <w:lang w:eastAsia="en-DE"/>
           <w14:ligatures w14:val="none"/>
         </w:rPr>
-        <w:lastRenderedPageBreak/>
         <w:t>Chapter 8 – HW/SW Co-Design</w:t>
       </w:r>
     </w:p>
@@ -21427,6 +23888,7 @@
           <w:lang w:eastAsia="en-DE"/>
           <w14:ligatures w14:val="none"/>
         </w:rPr>
+        <w:lastRenderedPageBreak/>
         <w:t>8.1 Co-Design Objectives</w:t>
       </w:r>
     </w:p>
@@ -21630,7 +24092,35 @@
           <w:lang w:eastAsia="en-DE"/>
           <w14:ligatures w14:val="none"/>
         </w:rPr>
-        <w:t>8.5 ModelSim Validation</w:t>
+        <w:t xml:space="preserve">8.5 </w:t>
+      </w:r>
+      <w:proofErr w:type="spellStart"/>
+      <w:r>
+        <w:rPr>
+          <w:rFonts w:ascii="Times New Roman" w:eastAsia="Times New Roman" w:hAnsi="Times New Roman" w:cs="Times New Roman"/>
+          <w:b/>
+          <w:bCs/>
+          <w:kern w:val="0"/>
+          <w:sz w:val="36"/>
+          <w:szCs w:val="36"/>
+          <w:lang w:eastAsia="en-DE"/>
+          <w14:ligatures w14:val="none"/>
+        </w:rPr>
+        <w:t>ModelSim</w:t>
+      </w:r>
+      <w:proofErr w:type="spellEnd"/>
+      <w:r>
+        <w:rPr>
+          <w:rFonts w:ascii="Times New Roman" w:eastAsia="Times New Roman" w:hAnsi="Times New Roman" w:cs="Times New Roman"/>
+          <w:b/>
+          <w:bCs/>
+          <w:kern w:val="0"/>
+          <w:sz w:val="36"/>
+          <w:szCs w:val="36"/>
+          <w:lang w:eastAsia="en-DE"/>
+          <w14:ligatures w14:val="none"/>
+        </w:rPr>
+        <w:t xml:space="preserve"> Validation</w:t>
       </w:r>
     </w:p>
     <w:p>
@@ -21964,7 +24454,6 @@
           <w:lang w:eastAsia="en-DE"/>
           <w14:ligatures w14:val="none"/>
         </w:rPr>
-        <w:lastRenderedPageBreak/>
         <w:t>10.1 Validation Strategy</w:t>
       </w:r>
     </w:p>
@@ -21994,6 +24483,7 @@
           <w:lang w:eastAsia="en-DE"/>
           <w14:ligatures w14:val="none"/>
         </w:rPr>
+        <w:lastRenderedPageBreak/>
         <w:t>10.2 Functional Testing</w:t>
       </w:r>
     </w:p>
@@ -22502,7 +24992,6 @@
           <w:lang w:eastAsia="en-DE"/>
           <w14:ligatures w14:val="none"/>
         </w:rPr>
-        <w:lastRenderedPageBreak/>
         <w:t>Chapter 12 – Project Management and Team Contributions</w:t>
       </w:r>
     </w:p>
@@ -22532,6 +25021,7 @@
           <w:lang w:eastAsia="en-DE"/>
           <w14:ligatures w14:val="none"/>
         </w:rPr>
+        <w:lastRenderedPageBreak/>
         <w:t>12.1 Project Planning</w:t>
       </w:r>
     </w:p>
@@ -23053,7 +25543,6 @@
           <w:lang w:eastAsia="en-DE"/>
           <w14:ligatures w14:val="none"/>
         </w:rPr>
-        <w:lastRenderedPageBreak/>
         <w:t>Appendix A – Complete Requirements Specification</w:t>
       </w:r>
     </w:p>
@@ -23083,7 +25572,35 @@
           <w:lang w:eastAsia="en-DE"/>
           <w14:ligatures w14:val="none"/>
         </w:rPr>
-        <w:t>Appendix B – SysML Diagrams</w:t>
+        <w:t xml:space="preserve">Appendix B – </w:t>
+      </w:r>
+      <w:proofErr w:type="spellStart"/>
+      <w:r>
+        <w:rPr>
+          <w:rFonts w:ascii="Times New Roman" w:eastAsia="Times New Roman" w:hAnsi="Times New Roman" w:cs="Times New Roman"/>
+          <w:b/>
+          <w:bCs/>
+          <w:kern w:val="0"/>
+          <w:sz w:val="36"/>
+          <w:szCs w:val="36"/>
+          <w:lang w:eastAsia="en-DE"/>
+          <w14:ligatures w14:val="none"/>
+        </w:rPr>
+        <w:t>SysML</w:t>
+      </w:r>
+      <w:proofErr w:type="spellEnd"/>
+      <w:r>
+        <w:rPr>
+          <w:rFonts w:ascii="Times New Roman" w:eastAsia="Times New Roman" w:hAnsi="Times New Roman" w:cs="Times New Roman"/>
+          <w:b/>
+          <w:bCs/>
+          <w:kern w:val="0"/>
+          <w:sz w:val="36"/>
+          <w:szCs w:val="36"/>
+          <w:lang w:eastAsia="en-DE"/>
+          <w14:ligatures w14:val="none"/>
+        </w:rPr>
+        <w:t xml:space="preserve"> Diagrams</w:t>
       </w:r>
     </w:p>
     <w:p>
@@ -23112,6 +25629,7 @@
           <w:lang w:eastAsia="en-DE"/>
           <w14:ligatures w14:val="none"/>
         </w:rPr>
+        <w:lastRenderedPageBreak/>
         <w:t>Appendix C – UPPAAL Models</w:t>
       </w:r>
     </w:p>
@@ -23141,7 +25659,35 @@
           <w:lang w:eastAsia="en-DE"/>
           <w14:ligatures w14:val="none"/>
         </w:rPr>
-        <w:t>Appendix D – FreeRTOS Configuration</w:t>
+        <w:t xml:space="preserve">Appendix D – </w:t>
+      </w:r>
+      <w:proofErr w:type="spellStart"/>
+      <w:r>
+        <w:rPr>
+          <w:rFonts w:ascii="Times New Roman" w:eastAsia="Times New Roman" w:hAnsi="Times New Roman" w:cs="Times New Roman"/>
+          <w:b/>
+          <w:bCs/>
+          <w:kern w:val="0"/>
+          <w:sz w:val="36"/>
+          <w:szCs w:val="36"/>
+          <w:lang w:eastAsia="en-DE"/>
+          <w14:ligatures w14:val="none"/>
+        </w:rPr>
+        <w:t>FreeRTOS</w:t>
+      </w:r>
+      <w:proofErr w:type="spellEnd"/>
+      <w:r>
+        <w:rPr>
+          <w:rFonts w:ascii="Times New Roman" w:eastAsia="Times New Roman" w:hAnsi="Times New Roman" w:cs="Times New Roman"/>
+          <w:b/>
+          <w:bCs/>
+          <w:kern w:val="0"/>
+          <w:sz w:val="36"/>
+          <w:szCs w:val="36"/>
+          <w:lang w:eastAsia="en-DE"/>
+          <w14:ligatures w14:val="none"/>
+        </w:rPr>
+        <w:t xml:space="preserve"> Configuration</w:t>
       </w:r>
     </w:p>
     <w:p>
@@ -23280,9 +25826,9 @@
 <file path=word/numbering.xml><?xml version="1.0" encoding="utf-8"?>
 <w:numbering xmlns:wpc="http://schemas.microsoft.com/office/word/2010/wordprocessingCanvas" xmlns:cx="http://schemas.microsoft.com/office/drawing/2014/chartex" xmlns:cx1="http://schemas.microsoft.com/office/drawing/2015/9/8/chartex" xmlns:cx2="http://schemas.microsoft.com/office/drawing/2015/10/21/chartex" xmlns:cx3="http://schemas.microsoft.com/office/drawing/2016/5/9/chartex" xmlns:cx4="http://schemas.microsoft.com/office/drawing/2016/5/10/chartex" xmlns:cx5="http://schemas.microsoft.com/office/drawing/2016/5/11/chartex" xmlns:cx6="http://schemas.microsoft.com/office/drawing/2016/5/12/chartex" xmlns:cx7="http://schemas.microsoft.com/office/drawing/2016/5/13/chartex" xmlns:cx8="http://schemas.microsoft.com/office/drawing/2016/5/14/chartex" xmlns:mc="http://schemas.openxmlformats.org/markup-compatibility/2006" xmlns:aink="http://schemas.microsoft.com/office/drawing/2016/ink" xmlns:am3d="http://schemas.microsoft.com/office/drawing/2017/model3d" xmlns:o="urn:schemas-microsoft-com:office:office" xmlns:oel="http://schemas.microsoft.com/office/2019/extlst" xmlns:r="http://schemas.openxmlformats.org/officeDocument/2006/relationships" xmlns:m="http://schemas.openxmlformats.org/officeDocument/2006/math" xmlns:v="urn:schemas-microsoft-com:vml" xmlns:wp14="http://schemas.microsoft.com/office/word/2010/wordprocessingDrawing" xmlns:wp="http://schemas.openxmlformats.org/drawingml/2006/wordprocessingDrawing" xmlns:w10="urn:schemas-microsoft-com:office:word" xmlns:w="http://schemas.openxmlformats.org/wordprocessingml/2006/main" xmlns:w14="http://schemas.microsoft.com/office/word/2010/wordml" xmlns:w15="http://schemas.microsoft.com/office/word/2012/wordml" xmlns:w16cex="http://schemas.microsoft.com/office/word/2018/wordml/cex" xmlns:w16cid="http://schemas.microsoft.com/office/word/2016/wordml/cid" xmlns:w16="http://schemas.microsoft.com/office/word/2018/wordml" xmlns:w16sdtdh="http://schemas.microsoft.com/office/word/2020/wordml/sdtdatahash" xmlns:w16se="http://schemas.microsoft.com/office/word/2015/wordml/symex" xmlns:wpg="http://schemas.microsoft.com/office/word/2010/wordprocessingGroup" xmlns:wpi="http://schemas.microsoft.com/office/word/2010/wordprocessingInk" xmlns:wne="http://schemas.microsoft.com/office/word/2006/wordml" xmlns:wps="http://schemas.microsoft.com/office/word/2010/wordprocessingShape" mc:Ignorable="w14 w15 w16se w16cid w16 w16cex w16sdtdh wp14">
   <w:abstractNum w:abstractNumId="0" w15:restartNumberingAfterBreak="0">
-    <w:nsid w:val="14E01C5E"/>
+    <w:nsid w:val="0A993BBB"/>
     <w:multiLevelType w:val="multilevel"/>
-    <w:tmpl w:val="E6C6BE24"/>
+    <w:tmpl w:val="5F9A2358"/>
     <w:lvl w:ilvl="0">
       <w:start w:val="1"/>
       <w:numFmt w:val="bullet"/>
@@ -23429,9 +25975,9 @@
     </w:lvl>
   </w:abstractNum>
   <w:abstractNum w:abstractNumId="1" w15:restartNumberingAfterBreak="0">
-    <w:nsid w:val="182D3921"/>
+    <w:nsid w:val="14E01C5E"/>
     <w:multiLevelType w:val="multilevel"/>
-    <w:tmpl w:val="F2EAA3B4"/>
+    <w:tmpl w:val="E6C6BE24"/>
     <w:lvl w:ilvl="0">
       <w:start w:val="1"/>
       <w:numFmt w:val="bullet"/>
@@ -23578,9 +26124,9 @@
     </w:lvl>
   </w:abstractNum>
   <w:abstractNum w:abstractNumId="2" w15:restartNumberingAfterBreak="0">
-    <w:nsid w:val="19644F47"/>
+    <w:nsid w:val="182D3921"/>
     <w:multiLevelType w:val="multilevel"/>
-    <w:tmpl w:val="5F7EC3F6"/>
+    <w:tmpl w:val="F2EAA3B4"/>
     <w:lvl w:ilvl="0">
       <w:start w:val="1"/>
       <w:numFmt w:val="bullet"/>
@@ -23727,9 +26273,9 @@
     </w:lvl>
   </w:abstractNum>
   <w:abstractNum w:abstractNumId="3" w15:restartNumberingAfterBreak="0">
-    <w:nsid w:val="1E47331A"/>
+    <w:nsid w:val="19644F47"/>
     <w:multiLevelType w:val="multilevel"/>
-    <w:tmpl w:val="6CC66A62"/>
+    <w:tmpl w:val="5F7EC3F6"/>
     <w:lvl w:ilvl="0">
       <w:start w:val="1"/>
       <w:numFmt w:val="bullet"/>
@@ -23876,9 +26422,9 @@
     </w:lvl>
   </w:abstractNum>
   <w:abstractNum w:abstractNumId="4" w15:restartNumberingAfterBreak="0">
-    <w:nsid w:val="21CF36D1"/>
+    <w:nsid w:val="1E47331A"/>
     <w:multiLevelType w:val="multilevel"/>
-    <w:tmpl w:val="63F8AB14"/>
+    <w:tmpl w:val="6CC66A62"/>
     <w:lvl w:ilvl="0">
       <w:start w:val="1"/>
       <w:numFmt w:val="bullet"/>
@@ -24025,9 +26571,9 @@
     </w:lvl>
   </w:abstractNum>
   <w:abstractNum w:abstractNumId="5" w15:restartNumberingAfterBreak="0">
-    <w:nsid w:val="365A6716"/>
+    <w:nsid w:val="21CF36D1"/>
     <w:multiLevelType w:val="multilevel"/>
-    <w:tmpl w:val="E4F89C40"/>
+    <w:tmpl w:val="63F8AB14"/>
     <w:lvl w:ilvl="0">
       <w:start w:val="1"/>
       <w:numFmt w:val="bullet"/>
@@ -24174,9 +26720,9 @@
     </w:lvl>
   </w:abstractNum>
   <w:abstractNum w:abstractNumId="6" w15:restartNumberingAfterBreak="0">
-    <w:nsid w:val="456F0741"/>
+    <w:nsid w:val="365A6716"/>
     <w:multiLevelType w:val="multilevel"/>
-    <w:tmpl w:val="EE3068D2"/>
+    <w:tmpl w:val="E4F89C40"/>
     <w:lvl w:ilvl="0">
       <w:start w:val="1"/>
       <w:numFmt w:val="bullet"/>
@@ -24322,26 +26868,330 @@
       </w:rPr>
     </w:lvl>
   </w:abstractNum>
+  <w:abstractNum w:abstractNumId="7" w15:restartNumberingAfterBreak="0">
+    <w:nsid w:val="456F0741"/>
+    <w:multiLevelType w:val="multilevel"/>
+    <w:tmpl w:val="EE3068D2"/>
+    <w:lvl w:ilvl="0">
+      <w:start w:val="1"/>
+      <w:numFmt w:val="bullet"/>
+      <w:lvlText w:val=""/>
+      <w:lvlJc w:val="left"/>
+      <w:pPr>
+        <w:tabs>
+          <w:tab w:val="num" w:pos="720"/>
+        </w:tabs>
+        <w:ind w:left="720" w:hanging="360"/>
+      </w:pPr>
+      <w:rPr>
+        <w:rFonts w:ascii="Symbol" w:hAnsi="Symbol" w:hint="default"/>
+        <w:sz w:val="20"/>
+      </w:rPr>
+    </w:lvl>
+    <w:lvl w:ilvl="1" w:tentative="1">
+      <w:start w:val="1"/>
+      <w:numFmt w:val="bullet"/>
+      <w:lvlText w:val="o"/>
+      <w:lvlJc w:val="left"/>
+      <w:pPr>
+        <w:tabs>
+          <w:tab w:val="num" w:pos="1440"/>
+        </w:tabs>
+        <w:ind w:left="1440" w:hanging="360"/>
+      </w:pPr>
+      <w:rPr>
+        <w:rFonts w:ascii="Courier New" w:hAnsi="Courier New" w:hint="default"/>
+        <w:sz w:val="20"/>
+      </w:rPr>
+    </w:lvl>
+    <w:lvl w:ilvl="2" w:tentative="1">
+      <w:start w:val="1"/>
+      <w:numFmt w:val="bullet"/>
+      <w:lvlText w:val=""/>
+      <w:lvlJc w:val="left"/>
+      <w:pPr>
+        <w:tabs>
+          <w:tab w:val="num" w:pos="2160"/>
+        </w:tabs>
+        <w:ind w:left="2160" w:hanging="360"/>
+      </w:pPr>
+      <w:rPr>
+        <w:rFonts w:ascii="Wingdings" w:hAnsi="Wingdings" w:hint="default"/>
+        <w:sz w:val="20"/>
+      </w:rPr>
+    </w:lvl>
+    <w:lvl w:ilvl="3" w:tentative="1">
+      <w:start w:val="1"/>
+      <w:numFmt w:val="bullet"/>
+      <w:lvlText w:val=""/>
+      <w:lvlJc w:val="left"/>
+      <w:pPr>
+        <w:tabs>
+          <w:tab w:val="num" w:pos="2880"/>
+        </w:tabs>
+        <w:ind w:left="2880" w:hanging="360"/>
+      </w:pPr>
+      <w:rPr>
+        <w:rFonts w:ascii="Wingdings" w:hAnsi="Wingdings" w:hint="default"/>
+        <w:sz w:val="20"/>
+      </w:rPr>
+    </w:lvl>
+    <w:lvl w:ilvl="4" w:tentative="1">
+      <w:start w:val="1"/>
+      <w:numFmt w:val="bullet"/>
+      <w:lvlText w:val=""/>
+      <w:lvlJc w:val="left"/>
+      <w:pPr>
+        <w:tabs>
+          <w:tab w:val="num" w:pos="3600"/>
+        </w:tabs>
+        <w:ind w:left="3600" w:hanging="360"/>
+      </w:pPr>
+      <w:rPr>
+        <w:rFonts w:ascii="Wingdings" w:hAnsi="Wingdings" w:hint="default"/>
+        <w:sz w:val="20"/>
+      </w:rPr>
+    </w:lvl>
+    <w:lvl w:ilvl="5" w:tentative="1">
+      <w:start w:val="1"/>
+      <w:numFmt w:val="bullet"/>
+      <w:lvlText w:val=""/>
+      <w:lvlJc w:val="left"/>
+      <w:pPr>
+        <w:tabs>
+          <w:tab w:val="num" w:pos="4320"/>
+        </w:tabs>
+        <w:ind w:left="4320" w:hanging="360"/>
+      </w:pPr>
+      <w:rPr>
+        <w:rFonts w:ascii="Wingdings" w:hAnsi="Wingdings" w:hint="default"/>
+        <w:sz w:val="20"/>
+      </w:rPr>
+    </w:lvl>
+    <w:lvl w:ilvl="6" w:tentative="1">
+      <w:start w:val="1"/>
+      <w:numFmt w:val="bullet"/>
+      <w:lvlText w:val=""/>
+      <w:lvlJc w:val="left"/>
+      <w:pPr>
+        <w:tabs>
+          <w:tab w:val="num" w:pos="5040"/>
+        </w:tabs>
+        <w:ind w:left="5040" w:hanging="360"/>
+      </w:pPr>
+      <w:rPr>
+        <w:rFonts w:ascii="Wingdings" w:hAnsi="Wingdings" w:hint="default"/>
+        <w:sz w:val="20"/>
+      </w:rPr>
+    </w:lvl>
+    <w:lvl w:ilvl="7" w:tentative="1">
+      <w:start w:val="1"/>
+      <w:numFmt w:val="bullet"/>
+      <w:lvlText w:val=""/>
+      <w:lvlJc w:val="left"/>
+      <w:pPr>
+        <w:tabs>
+          <w:tab w:val="num" w:pos="5760"/>
+        </w:tabs>
+        <w:ind w:left="5760" w:hanging="360"/>
+      </w:pPr>
+      <w:rPr>
+        <w:rFonts w:ascii="Wingdings" w:hAnsi="Wingdings" w:hint="default"/>
+        <w:sz w:val="20"/>
+      </w:rPr>
+    </w:lvl>
+    <w:lvl w:ilvl="8" w:tentative="1">
+      <w:start w:val="1"/>
+      <w:numFmt w:val="bullet"/>
+      <w:lvlText w:val=""/>
+      <w:lvlJc w:val="left"/>
+      <w:pPr>
+        <w:tabs>
+          <w:tab w:val="num" w:pos="6480"/>
+        </w:tabs>
+        <w:ind w:left="6480" w:hanging="360"/>
+      </w:pPr>
+      <w:rPr>
+        <w:rFonts w:ascii="Wingdings" w:hAnsi="Wingdings" w:hint="default"/>
+        <w:sz w:val="20"/>
+      </w:rPr>
+    </w:lvl>
+  </w:abstractNum>
+  <w:abstractNum w:abstractNumId="8" w15:restartNumberingAfterBreak="0">
+    <w:nsid w:val="5C86539F"/>
+    <w:multiLevelType w:val="multilevel"/>
+    <w:tmpl w:val="78AA9B62"/>
+    <w:lvl w:ilvl="0">
+      <w:start w:val="1"/>
+      <w:numFmt w:val="bullet"/>
+      <w:lvlText w:val=""/>
+      <w:lvlJc w:val="left"/>
+      <w:pPr>
+        <w:tabs>
+          <w:tab w:val="num" w:pos="720"/>
+        </w:tabs>
+        <w:ind w:left="720" w:hanging="360"/>
+      </w:pPr>
+      <w:rPr>
+        <w:rFonts w:ascii="Symbol" w:hAnsi="Symbol" w:hint="default"/>
+        <w:sz w:val="20"/>
+      </w:rPr>
+    </w:lvl>
+    <w:lvl w:ilvl="1" w:tentative="1">
+      <w:start w:val="1"/>
+      <w:numFmt w:val="bullet"/>
+      <w:lvlText w:val="o"/>
+      <w:lvlJc w:val="left"/>
+      <w:pPr>
+        <w:tabs>
+          <w:tab w:val="num" w:pos="1440"/>
+        </w:tabs>
+        <w:ind w:left="1440" w:hanging="360"/>
+      </w:pPr>
+      <w:rPr>
+        <w:rFonts w:ascii="Courier New" w:hAnsi="Courier New" w:hint="default"/>
+        <w:sz w:val="20"/>
+      </w:rPr>
+    </w:lvl>
+    <w:lvl w:ilvl="2" w:tentative="1">
+      <w:start w:val="1"/>
+      <w:numFmt w:val="bullet"/>
+      <w:lvlText w:val=""/>
+      <w:lvlJc w:val="left"/>
+      <w:pPr>
+        <w:tabs>
+          <w:tab w:val="num" w:pos="2160"/>
+        </w:tabs>
+        <w:ind w:left="2160" w:hanging="360"/>
+      </w:pPr>
+      <w:rPr>
+        <w:rFonts w:ascii="Wingdings" w:hAnsi="Wingdings" w:hint="default"/>
+        <w:sz w:val="20"/>
+      </w:rPr>
+    </w:lvl>
+    <w:lvl w:ilvl="3" w:tentative="1">
+      <w:start w:val="1"/>
+      <w:numFmt w:val="bullet"/>
+      <w:lvlText w:val=""/>
+      <w:lvlJc w:val="left"/>
+      <w:pPr>
+        <w:tabs>
+          <w:tab w:val="num" w:pos="2880"/>
+        </w:tabs>
+        <w:ind w:left="2880" w:hanging="360"/>
+      </w:pPr>
+      <w:rPr>
+        <w:rFonts w:ascii="Wingdings" w:hAnsi="Wingdings" w:hint="default"/>
+        <w:sz w:val="20"/>
+      </w:rPr>
+    </w:lvl>
+    <w:lvl w:ilvl="4" w:tentative="1">
+      <w:start w:val="1"/>
+      <w:numFmt w:val="bullet"/>
+      <w:lvlText w:val=""/>
+      <w:lvlJc w:val="left"/>
+      <w:pPr>
+        <w:tabs>
+          <w:tab w:val="num" w:pos="3600"/>
+        </w:tabs>
+        <w:ind w:left="3600" w:hanging="360"/>
+      </w:pPr>
+      <w:rPr>
+        <w:rFonts w:ascii="Wingdings" w:hAnsi="Wingdings" w:hint="default"/>
+        <w:sz w:val="20"/>
+      </w:rPr>
+    </w:lvl>
+    <w:lvl w:ilvl="5" w:tentative="1">
+      <w:start w:val="1"/>
+      <w:numFmt w:val="bullet"/>
+      <w:lvlText w:val=""/>
+      <w:lvlJc w:val="left"/>
+      <w:pPr>
+        <w:tabs>
+          <w:tab w:val="num" w:pos="4320"/>
+        </w:tabs>
+        <w:ind w:left="4320" w:hanging="360"/>
+      </w:pPr>
+      <w:rPr>
+        <w:rFonts w:ascii="Wingdings" w:hAnsi="Wingdings" w:hint="default"/>
+        <w:sz w:val="20"/>
+      </w:rPr>
+    </w:lvl>
+    <w:lvl w:ilvl="6" w:tentative="1">
+      <w:start w:val="1"/>
+      <w:numFmt w:val="bullet"/>
+      <w:lvlText w:val=""/>
+      <w:lvlJc w:val="left"/>
+      <w:pPr>
+        <w:tabs>
+          <w:tab w:val="num" w:pos="5040"/>
+        </w:tabs>
+        <w:ind w:left="5040" w:hanging="360"/>
+      </w:pPr>
+      <w:rPr>
+        <w:rFonts w:ascii="Wingdings" w:hAnsi="Wingdings" w:hint="default"/>
+        <w:sz w:val="20"/>
+      </w:rPr>
+    </w:lvl>
+    <w:lvl w:ilvl="7" w:tentative="1">
+      <w:start w:val="1"/>
+      <w:numFmt w:val="bullet"/>
+      <w:lvlText w:val=""/>
+      <w:lvlJc w:val="left"/>
+      <w:pPr>
+        <w:tabs>
+          <w:tab w:val="num" w:pos="5760"/>
+        </w:tabs>
+        <w:ind w:left="5760" w:hanging="360"/>
+      </w:pPr>
+      <w:rPr>
+        <w:rFonts w:ascii="Wingdings" w:hAnsi="Wingdings" w:hint="default"/>
+        <w:sz w:val="20"/>
+      </w:rPr>
+    </w:lvl>
+    <w:lvl w:ilvl="8" w:tentative="1">
+      <w:start w:val="1"/>
+      <w:numFmt w:val="bullet"/>
+      <w:lvlText w:val=""/>
+      <w:lvlJc w:val="left"/>
+      <w:pPr>
+        <w:tabs>
+          <w:tab w:val="num" w:pos="6480"/>
+        </w:tabs>
+        <w:ind w:left="6480" w:hanging="360"/>
+      </w:pPr>
+      <w:rPr>
+        <w:rFonts w:ascii="Wingdings" w:hAnsi="Wingdings" w:hint="default"/>
+        <w:sz w:val="20"/>
+      </w:rPr>
+    </w:lvl>
+  </w:abstractNum>
   <w:num w:numId="1" w16cid:durableId="1719621468">
+    <w:abstractNumId w:val="7"/>
+  </w:num>
+  <w:num w:numId="2" w16cid:durableId="1279407720">
+    <w:abstractNumId w:val="2"/>
+  </w:num>
+  <w:num w:numId="3" w16cid:durableId="601767235">
+    <w:abstractNumId w:val="3"/>
+  </w:num>
+  <w:num w:numId="4" w16cid:durableId="139229461">
+    <w:abstractNumId w:val="1"/>
+  </w:num>
+  <w:num w:numId="5" w16cid:durableId="1504466006">
     <w:abstractNumId w:val="6"/>
   </w:num>
-  <w:num w:numId="2" w16cid:durableId="1279407720">
-    <w:abstractNumId w:val="1"/>
+  <w:num w:numId="6" w16cid:durableId="1310407324">
+    <w:abstractNumId w:val="5"/>
   </w:num>
-  <w:num w:numId="3" w16cid:durableId="601767235">
-    <w:abstractNumId w:val="2"/>
+  <w:num w:numId="7" w16cid:durableId="1222248147">
+    <w:abstractNumId w:val="4"/>
   </w:num>
-  <w:num w:numId="4" w16cid:durableId="139229461">
+  <w:num w:numId="8" w16cid:durableId="365982653">
     <w:abstractNumId w:val="0"/>
   </w:num>
-  <w:num w:numId="5" w16cid:durableId="1504466006">
-    <w:abstractNumId w:val="5"/>
-  </w:num>
-  <w:num w:numId="6" w16cid:durableId="1310407324">
-    <w:abstractNumId w:val="4"/>
-  </w:num>
-  <w:num w:numId="7" w16cid:durableId="1222248147">
-    <w:abstractNumId w:val="3"/>
+  <w:num w:numId="9" w16cid:durableId="1130124410">
+    <w:abstractNumId w:val="8"/>
   </w:num>
 </w:numbering>
 </file>

</xml_diff>